<commit_message>
completed the non-functional requirements gathering
</commit_message>
<xml_diff>
--- a/documents/LevantamentoRequisitos PI03.docx
+++ b/documents/LevantamentoRequisitos PI03.docx
@@ -60,17 +60,6 @@
         <w:p>
           <w:pPr>
             <w:pStyle w:val="TOCHeading"/>
-          </w:pPr>
-          <w:r>
-            <w:t>Índice</w:t>
-          </w:r>
-        </w:p>
-        <w:p>
-          <w:pPr>
-            <w:pStyle w:val="TOC1"/>
-            <w:tabs>
-              <w:tab w:val="right" w:leader="dot" w:pos="9350"/>
-            </w:tabs>
             <w:rPr>
               <w:noProof/>
             </w:rPr>
@@ -1465,35 +1454,35 @@
         <w:rPr>
           <w:lang w:val="pt-BR"/>
         </w:rPr>
+        <w:tab/>
+        <w:t>- CPF.</w:t>
+      </w:r>
+    </w:p>
+    <w:p>
+      <w:pPr>
+        <w:rPr>
+          <w:lang w:val="pt-BR"/>
+        </w:rPr>
+      </w:pPr>
+      <w:r>
+        <w:rPr>
+          <w:lang w:val="pt-BR"/>
+        </w:rPr>
+        <w:tab/>
+        <w:t>- Telefone celular.</w:t>
+      </w:r>
+    </w:p>
+    <w:p>
+      <w:pPr>
+        <w:rPr>
+          <w:lang w:val="pt-BR"/>
+        </w:rPr>
+      </w:pPr>
+      <w:r>
+        <w:rPr>
+          <w:lang w:val="pt-BR"/>
+        </w:rPr>
         <w:lastRenderedPageBreak/>
-        <w:tab/>
-        <w:t>- CPF.</w:t>
-      </w:r>
-    </w:p>
-    <w:p>
-      <w:pPr>
-        <w:rPr>
-          <w:lang w:val="pt-BR"/>
-        </w:rPr>
-      </w:pPr>
-      <w:r>
-        <w:rPr>
-          <w:lang w:val="pt-BR"/>
-        </w:rPr>
-        <w:tab/>
-        <w:t>- Telefone celular.</w:t>
-      </w:r>
-    </w:p>
-    <w:p>
-      <w:pPr>
-        <w:rPr>
-          <w:lang w:val="pt-BR"/>
-        </w:rPr>
-      </w:pPr>
-      <w:r>
-        <w:rPr>
-          <w:lang w:val="pt-BR"/>
-        </w:rPr>
         <w:tab/>
         <w:t>- Senha.</w:t>
       </w:r>
@@ -1796,21 +1785,186 @@
         <w:rPr>
           <w:lang w:val="pt-BR"/>
         </w:rPr>
+        <w:t>- O sistema deve permitir a busca pelo nome da startup (*).</w:t>
+      </w:r>
+    </w:p>
+    <w:p>
+      <w:pPr>
+        <w:rPr>
+          <w:lang w:val="pt-BR"/>
+        </w:rPr>
+      </w:pPr>
+      <w:r>
+        <w:rPr>
+          <w:lang w:val="pt-BR"/>
+        </w:rPr>
+        <w:t>- Para cada startup, o sistema deve exibir:</w:t>
+      </w:r>
+    </w:p>
+    <w:p>
+      <w:pPr>
+        <w:ind w:firstLine="720"/>
+        <w:rPr>
+          <w:lang w:val="pt-BR"/>
+        </w:rPr>
+      </w:pPr>
+      <w:r>
+        <w:rPr>
+          <w:lang w:val="pt-BR"/>
+        </w:rPr>
         <w:lastRenderedPageBreak/>
-        <w:t>- O sistema deve permitir a busca pelo nome da startup (*).</w:t>
-      </w:r>
-    </w:p>
-    <w:p>
-      <w:pPr>
-        <w:rPr>
-          <w:lang w:val="pt-BR"/>
-        </w:rPr>
-      </w:pPr>
-      <w:r>
-        <w:rPr>
-          <w:lang w:val="pt-BR"/>
-        </w:rPr>
-        <w:t>- Para cada startup, o sistema deve exibir:</w:t>
+        <w:t>- Nome da Startup</w:t>
+      </w:r>
+      <w:r>
+        <w:rPr>
+          <w:lang w:val="pt-BR"/>
+        </w:rPr>
+        <w:t>.</w:t>
+      </w:r>
+    </w:p>
+    <w:p>
+      <w:pPr>
+        <w:rPr>
+          <w:lang w:val="pt-BR"/>
+        </w:rPr>
+      </w:pPr>
+      <w:r>
+        <w:rPr>
+          <w:lang w:val="pt-BR"/>
+        </w:rPr>
+        <w:tab/>
+        <w:t>- Gráfico com o histórico de valores dos tokens.</w:t>
+      </w:r>
+    </w:p>
+    <w:p>
+      <w:pPr>
+        <w:rPr>
+          <w:lang w:val="pt-BR"/>
+        </w:rPr>
+      </w:pPr>
+      <w:r>
+        <w:rPr>
+          <w:lang w:val="pt-BR"/>
+        </w:rPr>
+        <w:tab/>
+        <w:t xml:space="preserve">- Porcentagem de valorização da startup no </w:t>
+      </w:r>
+      <w:proofErr w:type="gramStart"/>
+      <w:r>
+        <w:rPr>
+          <w:lang w:val="pt-BR"/>
+        </w:rPr>
+        <w:t>ultimo</w:t>
+      </w:r>
+      <w:proofErr w:type="gramEnd"/>
+      <w:r>
+        <w:rPr>
+          <w:lang w:val="pt-BR"/>
+        </w:rPr>
+        <w:t xml:space="preserve"> mês.</w:t>
+      </w:r>
+    </w:p>
+    <w:p>
+      <w:pPr>
+        <w:rPr>
+          <w:lang w:val="pt-BR"/>
+        </w:rPr>
+      </w:pPr>
+      <w:r>
+        <w:rPr>
+          <w:lang w:val="pt-BR"/>
+        </w:rPr>
+        <w:tab/>
+        <w:t xml:space="preserve"> - Estágio da Startup.</w:t>
+      </w:r>
+    </w:p>
+    <w:p>
+      <w:pPr>
+        <w:rPr>
+          <w:lang w:val="pt-BR"/>
+        </w:rPr>
+      </w:pPr>
+      <w:r>
+        <w:rPr>
+          <w:lang w:val="pt-BR"/>
+        </w:rPr>
+        <w:tab/>
+        <w:t>- Valor do token atual.</w:t>
+      </w:r>
+    </w:p>
+    <w:p>
+      <w:pPr>
+        <w:rPr>
+          <w:lang w:val="pt-BR"/>
+        </w:rPr>
+      </w:pPr>
+      <w:r>
+        <w:rPr>
+          <w:lang w:val="pt-BR"/>
+        </w:rPr>
+        <w:tab/>
+        <w:t>- Breve descrição/resumo.</w:t>
+      </w:r>
+    </w:p>
+    <w:p>
+      <w:pPr>
+        <w:pStyle w:val="Heading3"/>
+        <w:rPr>
+          <w:lang w:val="pt-BR"/>
+        </w:rPr>
+      </w:pPr>
+      <w:bookmarkStart w:id="7" w:name="_Toc224244149"/>
+      <w:r>
+        <w:rPr>
+          <w:lang w:val="pt-BR"/>
+        </w:rPr>
+        <w:t xml:space="preserve">RF06 – </w:t>
+      </w:r>
+      <w:r>
+        <w:rPr>
+          <w:lang w:val="pt-BR"/>
+        </w:rPr>
+        <w:t>Página</w:t>
+      </w:r>
+      <w:r>
+        <w:rPr>
+          <w:lang w:val="pt-BR"/>
+        </w:rPr>
+        <w:t xml:space="preserve"> Detalhada de Startup:</w:t>
+      </w:r>
+      <w:bookmarkEnd w:id="7"/>
+    </w:p>
+    <w:p>
+      <w:pPr>
+        <w:rPr>
+          <w:lang w:val="pt-BR"/>
+        </w:rPr>
+      </w:pPr>
+      <w:r>
+        <w:rPr>
+          <w:lang w:val="pt-BR"/>
+        </w:rPr>
+        <w:t xml:space="preserve">- O sistema deve exibir uma tela </w:t>
+      </w:r>
+      <w:r>
+        <w:rPr>
+          <w:lang w:val="pt-BR"/>
+        </w:rPr>
+        <w:t>detalhada com:</w:t>
+      </w:r>
+    </w:p>
+    <w:p>
+      <w:pPr>
+        <w:rPr>
+          <w:lang w:val="pt-BR"/>
+        </w:rPr>
+      </w:pPr>
+      <w:r>
+        <w:rPr>
+          <w:lang w:val="pt-BR"/>
+        </w:rPr>
+        <w:tab/>
+        <w:t>- Nome da Startup</w:t>
       </w:r>
     </w:p>
     <w:p>
@@ -1824,7 +1978,563 @@
         <w:rPr>
           <w:lang w:val="pt-BR"/>
         </w:rPr>
-        <w:t>- Nome da Startup</w:t>
+        <w:t>- Descrição da Startup</w:t>
+      </w:r>
+    </w:p>
+    <w:p>
+      <w:pPr>
+        <w:ind w:firstLine="720"/>
+        <w:rPr>
+          <w:lang w:val="pt-BR"/>
+        </w:rPr>
+      </w:pPr>
+      <w:r>
+        <w:rPr>
+          <w:lang w:val="pt-BR"/>
+        </w:rPr>
+        <w:t xml:space="preserve">- </w:t>
+      </w:r>
+      <w:r>
+        <w:rPr>
+          <w:lang w:val="pt-BR"/>
+        </w:rPr>
+        <w:t>S</w:t>
+      </w:r>
+      <w:r>
+        <w:rPr>
+          <w:lang w:val="pt-BR"/>
+        </w:rPr>
+        <w:t>umário executivo</w:t>
+      </w:r>
+      <w:r>
+        <w:rPr>
+          <w:lang w:val="pt-BR"/>
+        </w:rPr>
+        <w:t xml:space="preserve"> da startup </w:t>
+      </w:r>
+      <w:r>
+        <w:rPr>
+          <w:lang w:val="pt-BR"/>
+        </w:rPr>
+        <w:t>(Documento curto que serve para captar investidores. Normalmente contém plano de negócios</w:t>
+      </w:r>
+      <w:r>
+        <w:rPr>
+          <w:lang w:val="pt-BR"/>
+        </w:rPr>
+        <w:t xml:space="preserve"> ou relatório, como objetivos, projeções financeiras e mercado alvo.)</w:t>
+      </w:r>
+    </w:p>
+    <w:p>
+      <w:pPr>
+        <w:ind w:firstLine="720"/>
+        <w:rPr>
+          <w:lang w:val="pt-BR"/>
+        </w:rPr>
+      </w:pPr>
+      <w:r>
+        <w:rPr>
+          <w:lang w:val="pt-BR"/>
+        </w:rPr>
+        <w:t>- Estrutura societária.</w:t>
+      </w:r>
+    </w:p>
+    <w:p>
+      <w:pPr>
+        <w:ind w:firstLine="720"/>
+        <w:rPr>
+          <w:lang w:val="pt-BR"/>
+        </w:rPr>
+      </w:pPr>
+      <w:r>
+        <w:rPr>
+          <w:lang w:val="pt-BR"/>
+        </w:rPr>
+        <w:t>- Apresentação dos sócios.</w:t>
+      </w:r>
+    </w:p>
+    <w:p>
+      <w:pPr>
+        <w:ind w:firstLine="720"/>
+        <w:rPr>
+          <w:lang w:val="pt-BR"/>
+        </w:rPr>
+      </w:pPr>
+      <w:r>
+        <w:rPr>
+          <w:lang w:val="pt-BR"/>
+        </w:rPr>
+        <w:t>- Volume de capital já aportado.</w:t>
+      </w:r>
+    </w:p>
+    <w:p>
+      <w:pPr>
+        <w:rPr>
+          <w:lang w:val="pt-BR"/>
+        </w:rPr>
+      </w:pPr>
+      <w:r>
+        <w:rPr>
+          <w:lang w:val="pt-BR"/>
+        </w:rPr>
+        <w:tab/>
+        <w:t>- Gráfico filtrável por período com o histórico de valor dos tokens.</w:t>
+      </w:r>
+    </w:p>
+    <w:p>
+      <w:pPr>
+        <w:rPr>
+          <w:lang w:val="pt-BR"/>
+        </w:rPr>
+      </w:pPr>
+      <w:r>
+        <w:rPr>
+          <w:lang w:val="pt-BR"/>
+        </w:rPr>
+        <w:tab/>
+        <w:t>- Quantidade de tokens emitidos.</w:t>
+      </w:r>
+    </w:p>
+    <w:p>
+      <w:pPr>
+        <w:ind w:firstLine="720"/>
+        <w:rPr>
+          <w:lang w:val="pt-BR"/>
+        </w:rPr>
+      </w:pPr>
+      <w:r>
+        <w:rPr>
+          <w:lang w:val="pt-BR"/>
+        </w:rPr>
+        <w:t>- Perguntas e respostas públicas sobre a startup.</w:t>
+      </w:r>
+    </w:p>
+    <w:p>
+      <w:pPr>
+        <w:ind w:firstLine="720"/>
+        <w:rPr>
+          <w:lang w:val="pt-BR"/>
+        </w:rPr>
+      </w:pPr>
+      <w:r>
+        <w:rPr>
+          <w:lang w:val="pt-BR"/>
+        </w:rPr>
+        <w:t>- Vídeos demonstrativos.</w:t>
+      </w:r>
+    </w:p>
+    <w:p>
+      <w:pPr>
+        <w:rPr>
+          <w:lang w:val="pt-BR"/>
+        </w:rPr>
+      </w:pPr>
+      <w:r>
+        <w:rPr>
+          <w:lang w:val="pt-BR"/>
+        </w:rPr>
+        <w:t>- Caso o usuário já seja investidor daquela startup, o sistema deve exibir mais funcionalidades na tela de startup, como:</w:t>
+      </w:r>
+      <w:r>
+        <w:rPr>
+          <w:lang w:val="pt-BR"/>
+        </w:rPr>
+        <w:br/>
+      </w:r>
+      <w:r>
+        <w:rPr>
+          <w:lang w:val="pt-BR"/>
+        </w:rPr>
+        <w:tab/>
+        <w:t>- Compra e venda de tokens, pela tela da startup.</w:t>
+      </w:r>
+    </w:p>
+    <w:p>
+      <w:pPr>
+        <w:rPr>
+          <w:lang w:val="pt-BR"/>
+        </w:rPr>
+      </w:pPr>
+      <w:r>
+        <w:rPr>
+          <w:lang w:val="pt-BR"/>
+        </w:rPr>
+        <w:tab/>
+        <w:t>- Envio de perguntas privadas/exclusivas (conforme regras da startup).</w:t>
+      </w:r>
+    </w:p>
+    <w:p>
+      <w:pPr>
+        <w:pStyle w:val="Heading3"/>
+        <w:rPr>
+          <w:lang w:val="pt-BR"/>
+        </w:rPr>
+      </w:pPr>
+      <w:bookmarkStart w:id="8" w:name="_Toc224244150"/>
+      <w:r>
+        <w:rPr>
+          <w:lang w:val="pt-BR"/>
+        </w:rPr>
+        <w:t>RF07- Perguntas Públicas:</w:t>
+      </w:r>
+      <w:bookmarkEnd w:id="8"/>
+    </w:p>
+    <w:p>
+      <w:pPr>
+        <w:rPr>
+          <w:lang w:val="pt-BR"/>
+        </w:rPr>
+      </w:pPr>
+      <w:r>
+        <w:rPr>
+          <w:lang w:val="pt-BR"/>
+        </w:rPr>
+        <w:t>- O sistema deve permitir que usuários não investidores enviem perguntas para uma startup.</w:t>
+      </w:r>
+    </w:p>
+    <w:p>
+      <w:pPr>
+        <w:rPr>
+          <w:lang w:val="pt-BR"/>
+        </w:rPr>
+      </w:pPr>
+      <w:r>
+        <w:rPr>
+          <w:lang w:val="pt-BR"/>
+        </w:rPr>
+        <w:t>- O sistema deve exibir as perguntas e respostas na seção ‘Perguntas e respostas públicas’.</w:t>
+      </w:r>
+    </w:p>
+    <w:p>
+      <w:pPr>
+        <w:rPr>
+          <w:lang w:val="pt-BR"/>
+        </w:rPr>
+      </w:pPr>
+      <w:r>
+        <w:rPr>
+          <w:lang w:val="pt-BR"/>
+        </w:rPr>
+        <w:lastRenderedPageBreak/>
+        <w:t>- O sistema deve permitir a exibição de respostas.</w:t>
+      </w:r>
+    </w:p>
+    <w:p>
+      <w:pPr>
+        <w:rPr>
+          <w:lang w:val="pt-BR"/>
+        </w:rPr>
+      </w:pPr>
+      <w:r>
+        <w:rPr>
+          <w:lang w:val="pt-BR"/>
+        </w:rPr>
+        <w:t xml:space="preserve">- As respostas devem ser cadastradas através do </w:t>
+      </w:r>
+      <w:proofErr w:type="spellStart"/>
+      <w:r>
+        <w:rPr>
+          <w:lang w:val="pt-BR"/>
+        </w:rPr>
+        <w:t>B</w:t>
+      </w:r>
+      <w:r>
+        <w:rPr>
+          <w:lang w:val="pt-BR"/>
+        </w:rPr>
+        <w:t>ackend</w:t>
+      </w:r>
+      <w:proofErr w:type="spellEnd"/>
+      <w:r>
+        <w:rPr>
+          <w:lang w:val="pt-BR"/>
+        </w:rPr>
+        <w:t xml:space="preserve"> ou outro fluxo.</w:t>
+      </w:r>
+    </w:p>
+    <w:p>
+      <w:pPr>
+        <w:pStyle w:val="Heading3"/>
+        <w:rPr>
+          <w:lang w:val="pt-BR"/>
+        </w:rPr>
+      </w:pPr>
+      <w:bookmarkStart w:id="9" w:name="_Toc224244151"/>
+      <w:r>
+        <w:rPr>
+          <w:lang w:val="pt-BR"/>
+        </w:rPr>
+        <w:t>RF08- Perguntas Privadas/ Exclusivas para investidores:</w:t>
+      </w:r>
+      <w:bookmarkEnd w:id="9"/>
+    </w:p>
+    <w:p>
+      <w:pPr>
+        <w:rPr>
+          <w:lang w:val="pt-BR"/>
+        </w:rPr>
+      </w:pPr>
+      <w:r>
+        <w:rPr>
+          <w:lang w:val="pt-BR"/>
+        </w:rPr>
+        <w:t>- Caso o usuário possua tokens da startup, o sistema deve permitir a opção de enviar perguntas privadas ou exclusivas para a startup, seguindo regras definidas pela startup.</w:t>
+      </w:r>
+    </w:p>
+    <w:p>
+      <w:pPr>
+        <w:rPr>
+          <w:lang w:val="pt-BR"/>
+        </w:rPr>
+      </w:pPr>
+      <w:r>
+        <w:rPr>
+          <w:lang w:val="pt-BR"/>
+        </w:rPr>
+        <w:t>- O sistema deve esconder a seção de ‘Perguntas e respostas privadas/exclusivas’ para usuários que não possuem tokens daquela startup, apenas conforme regras da startup.</w:t>
+      </w:r>
+    </w:p>
+    <w:p>
+      <w:pPr>
+        <w:pStyle w:val="Heading3"/>
+        <w:rPr>
+          <w:lang w:val="pt-BR"/>
+        </w:rPr>
+      </w:pPr>
+      <w:bookmarkStart w:id="10" w:name="_Toc224244152"/>
+      <w:r>
+        <w:rPr>
+          <w:lang w:val="pt-BR"/>
+        </w:rPr>
+        <w:t>RF09- Balcão de compra e venda de tokens:</w:t>
+      </w:r>
+      <w:bookmarkEnd w:id="10"/>
+    </w:p>
+    <w:p>
+      <w:pPr>
+        <w:rPr>
+          <w:lang w:val="pt-BR"/>
+        </w:rPr>
+      </w:pPr>
+      <w:r>
+        <w:rPr>
+          <w:lang w:val="pt-BR"/>
+        </w:rPr>
+        <w:t>- O sistema deve exibir</w:t>
+      </w:r>
+      <w:r>
+        <w:rPr>
+          <w:lang w:val="pt-BR"/>
+        </w:rPr>
+        <w:t xml:space="preserve"> </w:t>
+      </w:r>
+      <w:r>
+        <w:rPr>
+          <w:lang w:val="pt-BR"/>
+        </w:rPr>
+        <w:t xml:space="preserve">uma tela </w:t>
+      </w:r>
+      <w:r>
+        <w:rPr>
+          <w:lang w:val="pt-BR"/>
+        </w:rPr>
+        <w:t>para ofertas e transação de tokens</w:t>
+      </w:r>
+    </w:p>
+    <w:p>
+      <w:pPr>
+        <w:rPr>
+          <w:lang w:val="pt-BR"/>
+        </w:rPr>
+      </w:pPr>
+      <w:r>
+        <w:rPr>
+          <w:lang w:val="pt-BR"/>
+        </w:rPr>
+        <w:t>- Nessa tela, o usuário vai poder:</w:t>
+      </w:r>
+    </w:p>
+    <w:p>
+      <w:pPr>
+        <w:rPr>
+          <w:lang w:val="pt-BR"/>
+        </w:rPr>
+      </w:pPr>
+      <w:r>
+        <w:rPr>
+          <w:lang w:val="pt-BR"/>
+        </w:rPr>
+        <w:tab/>
+        <w:t>- Visualizar o seu saldo na carteira fictícia do app.</w:t>
+      </w:r>
+    </w:p>
+    <w:p>
+      <w:pPr>
+        <w:rPr>
+          <w:lang w:val="pt-BR"/>
+        </w:rPr>
+      </w:pPr>
+      <w:r>
+        <w:rPr>
+          <w:lang w:val="pt-BR"/>
+        </w:rPr>
+        <w:tab/>
+        <w:t>- Visualizar startups disponíveis para negociação.</w:t>
+      </w:r>
+    </w:p>
+    <w:p>
+      <w:pPr>
+        <w:ind w:firstLine="720"/>
+        <w:rPr>
+          <w:lang w:val="pt-BR"/>
+        </w:rPr>
+      </w:pPr>
+      <w:r>
+        <w:rPr>
+          <w:lang w:val="pt-BR"/>
+        </w:rPr>
+        <w:t xml:space="preserve"> </w:t>
+      </w:r>
+      <w:r>
+        <w:rPr>
+          <w:lang w:val="pt-BR"/>
+        </w:rPr>
+        <w:t>- Acessar o histórico de preços.</w:t>
+      </w:r>
+    </w:p>
+    <w:p>
+      <w:pPr>
+        <w:ind w:left="720"/>
+        <w:rPr>
+          <w:lang w:val="pt-BR"/>
+        </w:rPr>
+      </w:pPr>
+      <w:r>
+        <w:rPr>
+          <w:lang w:val="pt-BR"/>
+        </w:rPr>
+        <w:t>- Iniciar operações de compra e vend</w:t>
+      </w:r>
+      <w:r>
+        <w:rPr>
+          <w:lang w:val="pt-BR"/>
+        </w:rPr>
+        <w:t>a.</w:t>
+      </w:r>
+    </w:p>
+    <w:p>
+      <w:pPr>
+        <w:pStyle w:val="Heading3"/>
+        <w:rPr>
+          <w:lang w:val="pt-BR"/>
+        </w:rPr>
+      </w:pPr>
+      <w:bookmarkStart w:id="11" w:name="_Toc224244153"/>
+      <w:r>
+        <w:rPr>
+          <w:lang w:val="pt-BR"/>
+        </w:rPr>
+        <w:t>RF10</w:t>
+      </w:r>
+      <w:r>
+        <w:rPr>
+          <w:lang w:val="pt-BR"/>
+        </w:rPr>
+        <w:t>-</w:t>
+      </w:r>
+      <w:r>
+        <w:rPr>
+          <w:lang w:val="pt-BR"/>
+        </w:rPr>
+        <w:t xml:space="preserve"> Carteira:</w:t>
+      </w:r>
+      <w:bookmarkEnd w:id="11"/>
+    </w:p>
+    <w:p>
+      <w:pPr>
+        <w:rPr>
+          <w:lang w:val="pt-BR"/>
+        </w:rPr>
+      </w:pPr>
+      <w:r>
+        <w:rPr>
+          <w:lang w:val="pt-BR"/>
+        </w:rPr>
+        <w:t>- O sistema deve exibir uma tela para o usuário gerenciar sua carteira.</w:t>
+      </w:r>
+    </w:p>
+    <w:p>
+      <w:pPr>
+        <w:rPr>
+          <w:lang w:val="pt-BR"/>
+        </w:rPr>
+      </w:pPr>
+      <w:r>
+        <w:rPr>
+          <w:lang w:val="pt-BR"/>
+        </w:rPr>
+        <w:t>- O sistema deve manter para cada usuário, o seu saldo em reais (simulado)</w:t>
+      </w:r>
+    </w:p>
+    <w:p>
+      <w:pPr>
+        <w:rPr>
+          <w:lang w:val="pt-BR"/>
+        </w:rPr>
+      </w:pPr>
+      <w:r>
+        <w:rPr>
+          <w:lang w:val="pt-BR"/>
+        </w:rPr>
+        <w:t>- O usuário deve poder:</w:t>
+      </w:r>
+    </w:p>
+    <w:p>
+      <w:pPr>
+        <w:rPr>
+          <w:lang w:val="pt-BR"/>
+        </w:rPr>
+      </w:pPr>
+      <w:r>
+        <w:rPr>
+          <w:lang w:val="pt-BR"/>
+        </w:rPr>
+        <w:tab/>
+        <w:t>- Ver quanto saldo resta na sua carteira</w:t>
+      </w:r>
+    </w:p>
+    <w:p>
+      <w:pPr>
+        <w:rPr>
+          <w:lang w:val="pt-BR"/>
+        </w:rPr>
+      </w:pPr>
+      <w:r>
+        <w:rPr>
+          <w:lang w:val="pt-BR"/>
+        </w:rPr>
+        <w:tab/>
+        <w:t xml:space="preserve">- Ver </w:t>
+      </w:r>
+      <w:r>
+        <w:rPr>
+          <w:lang w:val="pt-BR"/>
+        </w:rPr>
+        <w:t>a quantidade de tokens ele tem (por startup, quais startups, total de tokens, total preço dos tokens).</w:t>
+      </w:r>
+    </w:p>
+    <w:p>
+      <w:pPr>
+        <w:rPr>
+          <w:lang w:val="pt-BR"/>
+        </w:rPr>
+      </w:pPr>
+      <w:r>
+        <w:rPr>
+          <w:lang w:val="pt-BR"/>
+        </w:rPr>
+        <w:tab/>
+        <w:t>- Ver quanto sua carteira valorizou a partir do momento de adicionar saldo (valorização dos tokens comprados)</w:t>
       </w:r>
       <w:r>
         <w:rPr>
@@ -1844,63 +2554,59 @@
           <w:lang w:val="pt-BR"/>
         </w:rPr>
         <w:tab/>
-        <w:t>- Gráfico com o histórico de valores dos tokens.</w:t>
-      </w:r>
-    </w:p>
-    <w:p>
-      <w:pPr>
-        <w:rPr>
-          <w:lang w:val="pt-BR"/>
-        </w:rPr>
-      </w:pPr>
-      <w:r>
-        <w:rPr>
-          <w:lang w:val="pt-BR"/>
-        </w:rPr>
-        <w:tab/>
-        <w:t>- Porcentagem de valorização da startup no ultimo mês.</w:t>
-      </w:r>
-    </w:p>
-    <w:p>
-      <w:pPr>
-        <w:rPr>
-          <w:lang w:val="pt-BR"/>
-        </w:rPr>
-      </w:pPr>
-      <w:r>
-        <w:rPr>
-          <w:lang w:val="pt-BR"/>
-        </w:rPr>
-        <w:tab/>
-        <w:t xml:space="preserve"> - Estágio da Startup.</w:t>
-      </w:r>
-    </w:p>
-    <w:p>
-      <w:pPr>
-        <w:rPr>
-          <w:lang w:val="pt-BR"/>
-        </w:rPr>
-      </w:pPr>
-      <w:r>
-        <w:rPr>
-          <w:lang w:val="pt-BR"/>
-        </w:rPr>
-        <w:tab/>
-        <w:t>- Valor do token atual.</w:t>
-      </w:r>
-    </w:p>
-    <w:p>
-      <w:pPr>
-        <w:rPr>
-          <w:lang w:val="pt-BR"/>
-        </w:rPr>
-      </w:pPr>
-      <w:r>
-        <w:rPr>
-          <w:lang w:val="pt-BR"/>
-        </w:rPr>
-        <w:tab/>
-        <w:t>- Breve descrição/resumo.</w:t>
+        <w:t>- Adicionar saldo à sua carteira.</w:t>
+      </w:r>
+      <w:r>
+        <w:rPr>
+          <w:lang w:val="pt-BR"/>
+        </w:rPr>
+        <w:t xml:space="preserve"> (Saldo inicial</w:t>
+      </w:r>
+      <w:r>
+        <w:rPr>
+          <w:lang w:val="pt-BR"/>
+        </w:rPr>
+        <w:t xml:space="preserve">? Pix simulado – Limitado com valor e por </w:t>
+      </w:r>
+      <w:proofErr w:type="gramStart"/>
+      <w:r>
+        <w:rPr>
+          <w:lang w:val="pt-BR"/>
+        </w:rPr>
+        <w:t>período de tempo</w:t>
+      </w:r>
+      <w:proofErr w:type="gramEnd"/>
+      <w:r>
+        <w:rPr>
+          <w:lang w:val="pt-BR"/>
+        </w:rPr>
+        <w:t>)</w:t>
+      </w:r>
+      <w:r>
+        <w:rPr>
+          <w:lang w:val="pt-BR"/>
+        </w:rPr>
+        <w:t>.</w:t>
+      </w:r>
+    </w:p>
+    <w:p>
+      <w:pPr>
+        <w:rPr>
+          <w:lang w:val="pt-BR"/>
+        </w:rPr>
+      </w:pPr>
+      <w:r>
+        <w:rPr>
+          <w:lang w:val="pt-BR"/>
+        </w:rPr>
+        <w:tab/>
+        <w:t>- Sacar saldo da sua carteira</w:t>
+      </w:r>
+      <w:r>
+        <w:rPr>
+          <w:lang w:val="pt-BR"/>
+        </w:rPr>
+        <w:t>.</w:t>
       </w:r>
     </w:p>
     <w:p>
@@ -1910,58 +2616,79 @@
           <w:lang w:val="pt-BR"/>
         </w:rPr>
       </w:pPr>
-      <w:bookmarkStart w:id="7" w:name="_Toc224244149"/>
-      <w:r>
-        <w:rPr>
-          <w:lang w:val="pt-BR"/>
-        </w:rPr>
-        <w:t xml:space="preserve">RF06 – </w:t>
-      </w:r>
-      <w:r>
-        <w:rPr>
-          <w:lang w:val="pt-BR"/>
-        </w:rPr>
-        <w:t>Página</w:t>
-      </w:r>
-      <w:r>
-        <w:rPr>
-          <w:lang w:val="pt-BR"/>
-        </w:rPr>
-        <w:t xml:space="preserve"> Detalhada de Startup:</w:t>
-      </w:r>
-      <w:bookmarkEnd w:id="7"/>
-    </w:p>
-    <w:p>
-      <w:pPr>
-        <w:rPr>
-          <w:lang w:val="pt-BR"/>
-        </w:rPr>
-      </w:pPr>
-      <w:r>
-        <w:rPr>
-          <w:lang w:val="pt-BR"/>
-        </w:rPr>
-        <w:t xml:space="preserve">- O sistema deve exibir uma tela </w:t>
-      </w:r>
-      <w:r>
-        <w:rPr>
-          <w:lang w:val="pt-BR"/>
-        </w:rPr>
-        <w:t>detalhada com:</w:t>
-      </w:r>
-    </w:p>
-    <w:p>
-      <w:pPr>
-        <w:rPr>
-          <w:lang w:val="pt-BR"/>
-        </w:rPr>
-      </w:pPr>
-      <w:r>
-        <w:rPr>
-          <w:lang w:val="pt-BR"/>
-        </w:rPr>
-        <w:tab/>
-        <w:t>- Nome da Startup</w:t>
+      <w:bookmarkStart w:id="12" w:name="_Toc224244154"/>
+      <w:r>
+        <w:rPr>
+          <w:lang w:val="pt-BR"/>
+        </w:rPr>
+        <w:t>RF</w:t>
+      </w:r>
+      <w:r>
+        <w:rPr>
+          <w:lang w:val="pt-BR"/>
+        </w:rPr>
+        <w:t>11</w:t>
+      </w:r>
+      <w:r>
+        <w:rPr>
+          <w:lang w:val="pt-BR"/>
+        </w:rPr>
+        <w:t>- Compra de tokens:</w:t>
+      </w:r>
+      <w:bookmarkEnd w:id="12"/>
+    </w:p>
+    <w:p>
+      <w:pPr>
+        <w:rPr>
+          <w:lang w:val="pt-BR"/>
+        </w:rPr>
+      </w:pPr>
+      <w:r>
+        <w:rPr>
+          <w:lang w:val="pt-BR"/>
+        </w:rPr>
+        <w:t>- O sistema deve permitir o usuário comprar tokens de uma startup:</w:t>
+      </w:r>
+    </w:p>
+    <w:p>
+      <w:pPr>
+        <w:rPr>
+          <w:lang w:val="pt-BR"/>
+        </w:rPr>
+      </w:pPr>
+      <w:r>
+        <w:rPr>
+          <w:lang w:val="pt-BR"/>
+        </w:rPr>
+        <w:lastRenderedPageBreak/>
+        <w:tab/>
+        <w:t>- Na tela de startup.</w:t>
+      </w:r>
+    </w:p>
+    <w:p>
+      <w:pPr>
+        <w:rPr>
+          <w:lang w:val="pt-BR"/>
+        </w:rPr>
+      </w:pPr>
+      <w:r>
+        <w:rPr>
+          <w:lang w:val="pt-BR"/>
+        </w:rPr>
+        <w:tab/>
+        <w:t>- Na tela de balcão</w:t>
+      </w:r>
+      <w:r>
+        <w:rPr>
+          <w:lang w:val="pt-BR"/>
+        </w:rPr>
+        <w:t xml:space="preserve"> de negociações</w:t>
+      </w:r>
+      <w:r>
+        <w:rPr>
+          <w:lang w:val="pt-BR"/>
+        </w:rPr>
+        <w:t>.</w:t>
       </w:r>
     </w:p>
     <w:p>
@@ -1975,7 +2702,20 @@
         <w:rPr>
           <w:lang w:val="pt-BR"/>
         </w:rPr>
-        <w:t>- Descrição da Startup</w:t>
+        <w:t>- O usuário pode colocar ofertas de acordo com o preço atual do token.</w:t>
+      </w:r>
+    </w:p>
+    <w:p>
+      <w:pPr>
+        <w:rPr>
+          <w:lang w:val="pt-BR"/>
+        </w:rPr>
+      </w:pPr>
+      <w:r>
+        <w:rPr>
+          <w:lang w:val="pt-BR"/>
+        </w:rPr>
+        <w:t>- Regras mínimas:</w:t>
       </w:r>
     </w:p>
     <w:p>
@@ -1989,37 +2729,51 @@
         <w:rPr>
           <w:lang w:val="pt-BR"/>
         </w:rPr>
+        <w:t>- O sistema deve validar se a startup tem tokens disponíveis para compra</w:t>
+      </w:r>
+      <w:r>
+        <w:rPr>
+          <w:lang w:val="pt-BR"/>
+        </w:rPr>
+        <w:t>.</w:t>
+      </w:r>
+    </w:p>
+    <w:p>
+      <w:pPr>
+        <w:ind w:firstLine="720"/>
+        <w:rPr>
+          <w:lang w:val="pt-BR"/>
+        </w:rPr>
+      </w:pPr>
+      <w:r>
+        <w:rPr>
+          <w:lang w:val="pt-BR"/>
+        </w:rPr>
         <w:t xml:space="preserve">- </w:t>
       </w:r>
       <w:r>
         <w:rPr>
           <w:lang w:val="pt-BR"/>
         </w:rPr>
-        <w:t>S</w:t>
-      </w:r>
-      <w:r>
-        <w:rPr>
-          <w:lang w:val="pt-BR"/>
-        </w:rPr>
-        <w:t>umário executivo</w:t>
-      </w:r>
-      <w:r>
-        <w:rPr>
-          <w:lang w:val="pt-BR"/>
-        </w:rPr>
-        <w:t xml:space="preserve"> da startup </w:t>
-      </w:r>
-      <w:r>
-        <w:rPr>
-          <w:lang w:val="pt-BR"/>
-        </w:rPr>
-        <w:t>(Documento curto que serve para captar investidores. Normalmente contém plano de negócios</w:t>
-      </w:r>
-      <w:r>
-        <w:rPr>
-          <w:lang w:val="pt-BR"/>
-        </w:rPr>
-        <w:t xml:space="preserve"> ou relatório, como objetivos, projeções financeiras e mercado alvo.)</w:t>
+        <w:t xml:space="preserve">O sistema deve validar se o usuário possui saldo disponível </w:t>
+      </w:r>
+      <w:r>
+        <w:rPr>
+          <w:lang w:val="pt-BR"/>
+        </w:rPr>
+        <w:t xml:space="preserve">e suficiente </w:t>
+      </w:r>
+      <w:r>
+        <w:rPr>
+          <w:lang w:val="pt-BR"/>
+        </w:rPr>
+        <w:t>em sua carteira antes de confirmar a compra</w:t>
+      </w:r>
+      <w:r>
+        <w:rPr>
+          <w:lang w:val="pt-BR"/>
+        </w:rPr>
+        <w:t>.</w:t>
       </w:r>
     </w:p>
     <w:p>
@@ -2033,7 +2787,7 @@
         <w:rPr>
           <w:lang w:val="pt-BR"/>
         </w:rPr>
-        <w:t>- Estrutura societária.</w:t>
+        <w:t>- O sistema confirmar com o usuário que ele está comprando X tokens por Y reais e vai sobrar Z reais de saldo.</w:t>
       </w:r>
     </w:p>
     <w:p>
@@ -2047,7 +2801,7 @@
         <w:rPr>
           <w:lang w:val="pt-BR"/>
         </w:rPr>
-        <w:t>- Apresentação dos sócios.</w:t>
+        <w:t>- O sistema deve debitar o valor da compra do saldo da carteira.</w:t>
       </w:r>
     </w:p>
     <w:p>
@@ -2061,35 +2815,7 @@
         <w:rPr>
           <w:lang w:val="pt-BR"/>
         </w:rPr>
-        <w:t>- Volume de capital já aportado.</w:t>
-      </w:r>
-    </w:p>
-    <w:p>
-      <w:pPr>
-        <w:rPr>
-          <w:lang w:val="pt-BR"/>
-        </w:rPr>
-      </w:pPr>
-      <w:r>
-        <w:rPr>
-          <w:lang w:val="pt-BR"/>
-        </w:rPr>
-        <w:tab/>
-        <w:t>- Gráfico filtrável por período com o histórico de valor dos tokens.</w:t>
-      </w:r>
-    </w:p>
-    <w:p>
-      <w:pPr>
-        <w:rPr>
-          <w:lang w:val="pt-BR"/>
-        </w:rPr>
-      </w:pPr>
-      <w:r>
-        <w:rPr>
-          <w:lang w:val="pt-BR"/>
-        </w:rPr>
-        <w:tab/>
-        <w:t>- Quantidade de tokens emitidos.</w:t>
+        <w:t>- O sistema deve registrar a quantidade de tokens adquiridos.</w:t>
       </w:r>
     </w:p>
     <w:p>
@@ -2103,62 +2829,42 @@
         <w:rPr>
           <w:lang w:val="pt-BR"/>
         </w:rPr>
-        <w:t>- Perguntas e respostas públicas sobre a startup.</w:t>
-      </w:r>
-    </w:p>
-    <w:p>
-      <w:pPr>
-        <w:ind w:firstLine="720"/>
-        <w:rPr>
-          <w:lang w:val="pt-BR"/>
-        </w:rPr>
-      </w:pPr>
-      <w:r>
-        <w:rPr>
-          <w:lang w:val="pt-BR"/>
-        </w:rPr>
-        <w:t>- Vídeos demonstrativos.</w:t>
-      </w:r>
-    </w:p>
-    <w:p>
-      <w:pPr>
-        <w:rPr>
-          <w:lang w:val="pt-BR"/>
-        </w:rPr>
-      </w:pPr>
-      <w:r>
-        <w:rPr>
-          <w:lang w:val="pt-BR"/>
-        </w:rPr>
-        <w:t>- Caso o usuário já seja investidor daquela startup, o sistema deve exibir mais funcionalidades na tela de startup, como:</w:t>
-      </w:r>
-      <w:r>
-        <w:rPr>
-          <w:lang w:val="pt-BR"/>
-        </w:rPr>
-        <w:br/>
-      </w:r>
-      <w:r>
-        <w:rPr>
-          <w:lang w:val="pt-BR"/>
-        </w:rPr>
-        <w:tab/>
-        <w:t>- Compra e venda de tokens, pela tela da startup.</w:t>
-      </w:r>
-    </w:p>
-    <w:p>
-      <w:pPr>
-        <w:rPr>
-          <w:lang w:val="pt-BR"/>
-        </w:rPr>
-      </w:pPr>
-      <w:r>
-        <w:rPr>
-          <w:lang w:val="pt-BR"/>
-        </w:rPr>
-        <w:tab/>
-        <w:t>- Envio de perguntas privadas/exclusivas (conforme regras da startup).</w:t>
-      </w:r>
+        <w:t>- O sistema deve registrar a transação no histórico (data/hora, quantidade, valor por token, valor total).</w:t>
+      </w:r>
+    </w:p>
+    <w:p>
+      <w:pPr>
+        <w:rPr>
+          <w:lang w:val="pt-BR"/>
+        </w:rPr>
+      </w:pPr>
+      <w:r>
+        <w:rPr>
+          <w:lang w:val="pt-BR"/>
+        </w:rPr>
+        <w:t xml:space="preserve">- Caso o usuário não tenha saldo suficiente, ele deve ser alertado e direcionado para a </w:t>
+      </w:r>
+      <w:proofErr w:type="gramStart"/>
+      <w:r>
+        <w:rPr>
+          <w:lang w:val="pt-BR"/>
+        </w:rPr>
+        <w:t>pagina</w:t>
+      </w:r>
+      <w:proofErr w:type="gramEnd"/>
+      <w:r>
+        <w:rPr>
+          <w:lang w:val="pt-BR"/>
+        </w:rPr>
+        <w:t xml:space="preserve"> de carteira para adicionar saldo, após o usuário adicionar saldo, confirmar se o usuário quer comprar os tokens. Fluxo: (Comprar tokens-&gt;Saldo Insuficiente-&gt;Ir para carteira/Cancelar-&gt;Adicionou Saldo-&gt;Tela de compra-&gt;Confirmar Compra-&gt;Dashboard)</w:t>
+      </w:r>
+    </w:p>
+    <w:p>
+      <w:pPr>
+        <w:rPr>
+          <w:lang w:val="pt-BR"/>
+        </w:rPr>
+      </w:pPr>
     </w:p>
     <w:p>
       <w:pPr>
@@ -2167,84 +2873,199 @@
           <w:lang w:val="pt-BR"/>
         </w:rPr>
       </w:pPr>
-      <w:bookmarkStart w:id="8" w:name="_Toc224244150"/>
+      <w:bookmarkStart w:id="13" w:name="_Toc224244155"/>
+      <w:r>
+        <w:rPr>
+          <w:lang w:val="pt-BR"/>
+        </w:rPr>
+        <w:t>RF12- Venda de tokens</w:t>
+      </w:r>
+      <w:r>
+        <w:rPr>
+          <w:lang w:val="pt-BR"/>
+        </w:rPr>
+        <w:t>:</w:t>
+      </w:r>
+      <w:bookmarkEnd w:id="13"/>
+    </w:p>
+    <w:p>
+      <w:pPr>
+        <w:rPr>
+          <w:lang w:val="pt-BR"/>
+        </w:rPr>
+      </w:pPr>
+      <w:r>
+        <w:rPr>
+          <w:lang w:val="pt-BR"/>
+        </w:rPr>
+        <w:t>- O sistema deve permitir o usuário vender tokens:</w:t>
+      </w:r>
+    </w:p>
+    <w:p>
+      <w:pPr>
+        <w:rPr>
+          <w:lang w:val="pt-BR"/>
+        </w:rPr>
+      </w:pPr>
+      <w:r>
+        <w:rPr>
+          <w:lang w:val="pt-BR"/>
+        </w:rPr>
+        <w:tab/>
+        <w:t>- Na tela da startup.</w:t>
+      </w:r>
+    </w:p>
+    <w:p>
+      <w:pPr>
+        <w:rPr>
+          <w:lang w:val="pt-BR"/>
+        </w:rPr>
+      </w:pPr>
+      <w:r>
+        <w:rPr>
+          <w:lang w:val="pt-BR"/>
+        </w:rPr>
+        <w:tab/>
+        <w:t>- Na tela do balcão de negociações</w:t>
+      </w:r>
+    </w:p>
+    <w:p>
+      <w:pPr>
+        <w:rPr>
+          <w:lang w:val="pt-BR"/>
+        </w:rPr>
+      </w:pPr>
+      <w:r>
+        <w:rPr>
+          <w:lang w:val="pt-BR"/>
+        </w:rPr>
+        <w:t>- O usuário pode vender tokens de acordo com o preço atual do token.</w:t>
+      </w:r>
+    </w:p>
+    <w:p>
+      <w:pPr>
+        <w:rPr>
+          <w:lang w:val="pt-BR"/>
+        </w:rPr>
+      </w:pPr>
+      <w:r>
+        <w:rPr>
+          <w:lang w:val="pt-BR"/>
+        </w:rPr>
+        <w:t>- Regras mínimas:</w:t>
+      </w:r>
+    </w:p>
+    <w:p>
+      <w:pPr>
+        <w:rPr>
+          <w:lang w:val="pt-BR"/>
+        </w:rPr>
+      </w:pPr>
+      <w:r>
+        <w:rPr>
+          <w:lang w:val="pt-BR"/>
+        </w:rPr>
+        <w:tab/>
+        <w:t>- O sistema deve verificar se o usuário possui quantidade suficiente de tokens.</w:t>
+      </w:r>
+    </w:p>
+    <w:p>
+      <w:pPr>
+        <w:rPr>
+          <w:lang w:val="pt-BR"/>
+        </w:rPr>
+      </w:pPr>
+      <w:r>
+        <w:rPr>
+          <w:lang w:val="pt-BR"/>
+        </w:rPr>
+        <w:tab/>
+        <w:t xml:space="preserve">-  </w:t>
+      </w:r>
+      <w:r>
+        <w:rPr>
+          <w:lang w:val="pt-BR"/>
+        </w:rPr>
+        <w:t xml:space="preserve">O sistema deve </w:t>
+      </w:r>
+      <w:r>
+        <w:rPr>
+          <w:lang w:val="pt-BR"/>
+        </w:rPr>
+        <w:t>debitar a quantidade de tokens vendidos do usuário.</w:t>
+      </w:r>
+    </w:p>
+    <w:p>
+      <w:pPr>
+        <w:rPr>
+          <w:lang w:val="pt-BR"/>
+        </w:rPr>
+      </w:pPr>
+      <w:r>
+        <w:rPr>
+          <w:lang w:val="pt-BR"/>
+        </w:rPr>
+        <w:tab/>
+        <w:t>-</w:t>
+      </w:r>
+      <w:r>
+        <w:rPr>
+          <w:lang w:val="pt-BR"/>
+        </w:rPr>
+        <w:t xml:space="preserve"> </w:t>
+      </w:r>
+      <w:r>
+        <w:rPr>
+          <w:lang w:val="pt-BR"/>
+        </w:rPr>
+        <w:t>O sistema deve</w:t>
+      </w:r>
+      <w:r>
+        <w:rPr>
+          <w:lang w:val="pt-BR"/>
+        </w:rPr>
+        <w:t xml:space="preserve"> adicionar o valor dos tokens vendidos na carteira do usuário.</w:t>
+      </w:r>
+    </w:p>
+    <w:p>
+      <w:pPr>
+        <w:rPr>
+          <w:lang w:val="pt-BR"/>
+        </w:rPr>
+      </w:pPr>
       <w:r>
         <w:rPr>
           <w:lang w:val="pt-BR"/>
         </w:rPr>
         <w:lastRenderedPageBreak/>
-        <w:t>RF07- Perguntas Públicas:</w:t>
-      </w:r>
-      <w:bookmarkEnd w:id="8"/>
-    </w:p>
-    <w:p>
-      <w:pPr>
-        <w:rPr>
-          <w:lang w:val="pt-BR"/>
-        </w:rPr>
-      </w:pPr>
-      <w:r>
-        <w:rPr>
-          <w:lang w:val="pt-BR"/>
-        </w:rPr>
-        <w:t>- O sistema deve permitir que usuários não investidores enviem perguntas para uma startup.</w:t>
-      </w:r>
-    </w:p>
-    <w:p>
-      <w:pPr>
-        <w:rPr>
-          <w:lang w:val="pt-BR"/>
-        </w:rPr>
-      </w:pPr>
-      <w:r>
-        <w:rPr>
-          <w:lang w:val="pt-BR"/>
-        </w:rPr>
-        <w:t>- O sistema deve exibir as perguntas e respostas na seção ‘Perguntas e respostas públicas’.</w:t>
-      </w:r>
-    </w:p>
-    <w:p>
-      <w:pPr>
-        <w:rPr>
-          <w:lang w:val="pt-BR"/>
-        </w:rPr>
-      </w:pPr>
-      <w:r>
-        <w:rPr>
-          <w:lang w:val="pt-BR"/>
-        </w:rPr>
-        <w:t>- O sistema deve permitir a exibição de respostas.</w:t>
-      </w:r>
-    </w:p>
-    <w:p>
-      <w:pPr>
-        <w:rPr>
-          <w:lang w:val="pt-BR"/>
-        </w:rPr>
-      </w:pPr>
-      <w:r>
-        <w:rPr>
-          <w:lang w:val="pt-BR"/>
-        </w:rPr>
-        <w:t xml:space="preserve">- As respostas devem ser cadastradas através do </w:t>
-      </w:r>
-      <w:r>
-        <w:rPr>
-          <w:lang w:val="pt-BR"/>
-        </w:rPr>
-        <w:t>B</w:t>
-      </w:r>
-      <w:r>
-        <w:rPr>
-          <w:lang w:val="pt-BR"/>
-        </w:rPr>
-        <w:t>ackend</w:t>
-      </w:r>
-      <w:r>
-        <w:rPr>
-          <w:lang w:val="pt-BR"/>
-        </w:rPr>
-        <w:t xml:space="preserve"> ou outro fluxo.</w:t>
+        <w:tab/>
+        <w:t xml:space="preserve">- </w:t>
+      </w:r>
+      <w:r>
+        <w:rPr>
+          <w:lang w:val="pt-BR"/>
+        </w:rPr>
+        <w:t xml:space="preserve">O sistema deve </w:t>
+      </w:r>
+      <w:r>
+        <w:rPr>
+          <w:lang w:val="pt-BR"/>
+        </w:rPr>
+        <w:t xml:space="preserve">registrar a transação no </w:t>
+      </w:r>
+      <w:proofErr w:type="gramStart"/>
+      <w:r>
+        <w:rPr>
+          <w:lang w:val="pt-BR"/>
+        </w:rPr>
+        <w:t>histórico(</w:t>
+      </w:r>
+      <w:proofErr w:type="gramEnd"/>
+      <w:r>
+        <w:rPr>
+          <w:lang w:val="pt-BR"/>
+        </w:rPr>
+        <w:t>data/hora, quantidade, valor por token, valor total)</w:t>
       </w:r>
     </w:p>
     <w:p>
@@ -2254,39 +3075,295 @@
           <w:lang w:val="pt-BR"/>
         </w:rPr>
       </w:pPr>
-      <w:bookmarkStart w:id="9" w:name="_Toc224244151"/>
-      <w:r>
-        <w:rPr>
-          <w:lang w:val="pt-BR"/>
-        </w:rPr>
-        <w:t>RF08- Perguntas Privadas/ Exclusivas para investidores:</w:t>
-      </w:r>
-      <w:bookmarkEnd w:id="9"/>
-    </w:p>
-    <w:p>
-      <w:pPr>
-        <w:rPr>
-          <w:lang w:val="pt-BR"/>
-        </w:rPr>
-      </w:pPr>
-      <w:r>
-        <w:rPr>
-          <w:lang w:val="pt-BR"/>
-        </w:rPr>
-        <w:t>- Caso o usuário possua tokens da startup, o sistema deve permitir a opção de enviar perguntas privadas ou exclusivas para a startup, seguindo regras definidas pela startup.</w:t>
-      </w:r>
-    </w:p>
-    <w:p>
-      <w:pPr>
-        <w:rPr>
-          <w:lang w:val="pt-BR"/>
-        </w:rPr>
-      </w:pPr>
-      <w:r>
-        <w:rPr>
-          <w:lang w:val="pt-BR"/>
-        </w:rPr>
-        <w:t>- O sistema deve esconder a seção de ‘Perguntas e respostas privadas/exclusivas’ para usuários que não possuem tokens daquela startup, apenas conforme regras da startup.</w:t>
+      <w:bookmarkStart w:id="14" w:name="_Toc224244156"/>
+      <w:r>
+        <w:rPr>
+          <w:lang w:val="pt-BR"/>
+        </w:rPr>
+        <w:t>RF13- Dashboard de investimentos e valorização:</w:t>
+      </w:r>
+      <w:bookmarkEnd w:id="14"/>
+    </w:p>
+    <w:p>
+      <w:pPr>
+        <w:rPr>
+          <w:lang w:val="pt-BR"/>
+        </w:rPr>
+      </w:pPr>
+      <w:r>
+        <w:rPr>
+          <w:lang w:val="pt-BR"/>
+        </w:rPr>
+        <w:t>- O sistema deve exibir um painel dashboard com:</w:t>
+      </w:r>
+    </w:p>
+    <w:p>
+      <w:pPr>
+        <w:rPr>
+          <w:lang w:val="pt-BR"/>
+        </w:rPr>
+      </w:pPr>
+      <w:r>
+        <w:rPr>
+          <w:lang w:val="pt-BR"/>
+        </w:rPr>
+        <w:tab/>
+        <w:t>- Lista de startups que o usuário possui token.</w:t>
+      </w:r>
+    </w:p>
+    <w:p>
+      <w:pPr>
+        <w:rPr>
+          <w:lang w:val="pt-BR"/>
+        </w:rPr>
+      </w:pPr>
+      <w:r>
+        <w:rPr>
+          <w:lang w:val="pt-BR"/>
+        </w:rPr>
+        <w:tab/>
+        <w:t xml:space="preserve">- </w:t>
+      </w:r>
+      <w:r>
+        <w:rPr>
+          <w:lang w:val="pt-BR"/>
+        </w:rPr>
+        <w:t>Pequeno gráfico para cada startup investida.</w:t>
+      </w:r>
+    </w:p>
+    <w:p>
+      <w:pPr>
+        <w:rPr>
+          <w:lang w:val="pt-BR"/>
+        </w:rPr>
+      </w:pPr>
+      <w:r>
+        <w:rPr>
+          <w:lang w:val="pt-BR"/>
+        </w:rPr>
+        <w:tab/>
+        <w:t>- Porcentagem de lucro a partir do momento da compra do token.</w:t>
+      </w:r>
+    </w:p>
+    <w:p>
+      <w:pPr>
+        <w:rPr>
+          <w:lang w:val="pt-BR"/>
+        </w:rPr>
+      </w:pPr>
+      <w:r>
+        <w:rPr>
+          <w:lang w:val="pt-BR"/>
+        </w:rPr>
+        <w:tab/>
+        <w:t>- Quantidade de token por startup.</w:t>
+      </w:r>
+    </w:p>
+    <w:p>
+      <w:pPr>
+        <w:rPr>
+          <w:lang w:val="pt-BR"/>
+        </w:rPr>
+      </w:pPr>
+      <w:r>
+        <w:rPr>
+          <w:lang w:val="pt-BR"/>
+        </w:rPr>
+        <w:tab/>
+        <w:t>- Valor atual de cada investimento.</w:t>
+      </w:r>
+    </w:p>
+    <w:p>
+      <w:pPr>
+        <w:rPr>
+          <w:lang w:val="pt-BR"/>
+        </w:rPr>
+      </w:pPr>
+      <w:r>
+        <w:rPr>
+          <w:lang w:val="pt-BR"/>
+        </w:rPr>
+        <w:tab/>
+        <w:t>- Valor total da carteira de tokens (reais).</w:t>
+      </w:r>
+    </w:p>
+    <w:p>
+      <w:pPr>
+        <w:rPr>
+          <w:lang w:val="pt-BR"/>
+        </w:rPr>
+      </w:pPr>
+      <w:r>
+        <w:rPr>
+          <w:lang w:val="pt-BR"/>
+        </w:rPr>
+        <w:tab/>
+        <w:t>- Gráfico de valorização da carteira.</w:t>
+      </w:r>
+    </w:p>
+    <w:p>
+      <w:pPr>
+        <w:rPr>
+          <w:lang w:val="pt-BR"/>
+        </w:rPr>
+      </w:pPr>
+      <w:r>
+        <w:rPr>
+          <w:lang w:val="pt-BR"/>
+        </w:rPr>
+        <w:t>- O sistema deve permitir a filtragem dos gráficos exibidos com a variação do valor dos tokens com os seguintes períodos:</w:t>
+      </w:r>
+    </w:p>
+    <w:p>
+      <w:pPr>
+        <w:rPr>
+          <w:lang w:val="pt-BR"/>
+        </w:rPr>
+      </w:pPr>
+      <w:r>
+        <w:rPr>
+          <w:lang w:val="pt-BR"/>
+        </w:rPr>
+        <w:tab/>
+        <w:t>- Diário.</w:t>
+      </w:r>
+    </w:p>
+    <w:p>
+      <w:pPr>
+        <w:rPr>
+          <w:lang w:val="pt-BR"/>
+        </w:rPr>
+      </w:pPr>
+      <w:r>
+        <w:rPr>
+          <w:lang w:val="pt-BR"/>
+        </w:rPr>
+        <w:tab/>
+        <w:t>- Semanal.</w:t>
+      </w:r>
+    </w:p>
+    <w:p>
+      <w:pPr>
+        <w:rPr>
+          <w:lang w:val="pt-BR"/>
+        </w:rPr>
+      </w:pPr>
+      <w:r>
+        <w:rPr>
+          <w:lang w:val="pt-BR"/>
+        </w:rPr>
+        <w:tab/>
+        <w:t>- Mensal.</w:t>
+      </w:r>
+    </w:p>
+    <w:p>
+      <w:pPr>
+        <w:rPr>
+          <w:lang w:val="pt-BR"/>
+        </w:rPr>
+      </w:pPr>
+      <w:r>
+        <w:rPr>
+          <w:lang w:val="pt-BR"/>
+        </w:rPr>
+        <w:tab/>
+        <w:t xml:space="preserve">- </w:t>
+      </w:r>
+      <w:r>
+        <w:rPr>
+          <w:lang w:val="pt-BR"/>
+        </w:rPr>
+        <w:t>Últimos</w:t>
+      </w:r>
+      <w:r>
+        <w:rPr>
+          <w:lang w:val="pt-BR"/>
+        </w:rPr>
+        <w:t xml:space="preserve"> 6 meses.</w:t>
+      </w:r>
+    </w:p>
+    <w:p>
+      <w:pPr>
+        <w:rPr>
+          <w:lang w:val="pt-BR"/>
+        </w:rPr>
+      </w:pPr>
+      <w:r>
+        <w:rPr>
+          <w:lang w:val="pt-BR"/>
+        </w:rPr>
+        <w:tab/>
+        <w:t>- YTD.</w:t>
+      </w:r>
+    </w:p>
+    <w:p>
+      <w:pPr>
+        <w:rPr>
+          <w:lang w:val="pt-BR"/>
+        </w:rPr>
+      </w:pPr>
+      <w:r>
+        <w:rPr>
+          <w:lang w:val="pt-BR"/>
+        </w:rPr>
+        <w:t xml:space="preserve">- A logica de </w:t>
+      </w:r>
+      <w:r>
+        <w:rPr>
+          <w:lang w:val="pt-BR"/>
+        </w:rPr>
+        <w:t>cálculo</w:t>
+      </w:r>
+      <w:r>
+        <w:rPr>
+          <w:lang w:val="pt-BR"/>
+        </w:rPr>
+        <w:t xml:space="preserve"> do valor dos tokens (preço, variação, tendência) vai ser com base no mercado real, com um </w:t>
+      </w:r>
+      <w:r>
+        <w:rPr>
+          <w:lang w:val="pt-BR"/>
+        </w:rPr>
+        <w:t>‘</w:t>
+      </w:r>
+      <w:proofErr w:type="spellStart"/>
+      <w:r>
+        <w:rPr>
+          <w:lang w:val="pt-BR"/>
+        </w:rPr>
+        <w:t>order</w:t>
+      </w:r>
+      <w:proofErr w:type="spellEnd"/>
+      <w:r>
+        <w:rPr>
+          <w:lang w:val="pt-BR"/>
+        </w:rPr>
+        <w:t xml:space="preserve"> book</w:t>
+      </w:r>
+      <w:r>
+        <w:rPr>
+          <w:lang w:val="pt-BR"/>
+        </w:rPr>
+        <w:t>’</w:t>
+      </w:r>
+      <w:r>
+        <w:rPr>
+          <w:lang w:val="pt-BR"/>
+        </w:rPr>
+        <w:t xml:space="preserve"> para cada token.</w:t>
+      </w:r>
+    </w:p>
+    <w:p>
+      <w:pPr>
+        <w:rPr>
+          <w:lang w:val="pt-BR"/>
+        </w:rPr>
+      </w:pPr>
+      <w:r>
+        <w:rPr>
+          <w:lang w:val="pt-BR"/>
+        </w:rPr>
+        <w:t>- Para melhor simulação e manter uma liquidez e movimento mais “real” do mercado, vamos utilizar um simulador de Montecarlo.</w:t>
       </w:r>
     </w:p>
     <w:p>
@@ -2296,246 +3373,68 @@
           <w:lang w:val="pt-BR"/>
         </w:rPr>
       </w:pPr>
-      <w:bookmarkStart w:id="10" w:name="_Toc224244152"/>
-      <w:r>
-        <w:rPr>
-          <w:lang w:val="pt-BR"/>
-        </w:rPr>
-        <w:t>RF09- Balcão de compra e venda de tokens:</w:t>
-      </w:r>
-      <w:bookmarkEnd w:id="10"/>
-    </w:p>
-    <w:p>
-      <w:pPr>
-        <w:rPr>
-          <w:lang w:val="pt-BR"/>
-        </w:rPr>
-      </w:pPr>
-      <w:r>
-        <w:rPr>
-          <w:lang w:val="pt-BR"/>
-        </w:rPr>
-        <w:t>- O sistema deve exibir</w:t>
-      </w:r>
-      <w:r>
-        <w:rPr>
-          <w:lang w:val="pt-BR"/>
-        </w:rPr>
-        <w:t xml:space="preserve"> </w:t>
-      </w:r>
-      <w:r>
-        <w:rPr>
-          <w:lang w:val="pt-BR"/>
-        </w:rPr>
-        <w:t xml:space="preserve">uma tela </w:t>
-      </w:r>
-      <w:r>
-        <w:rPr>
-          <w:lang w:val="pt-BR"/>
-        </w:rPr>
-        <w:t>para ofertas e transação de tokens</w:t>
-      </w:r>
-    </w:p>
-    <w:p>
-      <w:pPr>
-        <w:rPr>
-          <w:lang w:val="pt-BR"/>
-        </w:rPr>
-      </w:pPr>
-      <w:r>
-        <w:rPr>
-          <w:lang w:val="pt-BR"/>
-        </w:rPr>
-        <w:t>- Nessa tela, o usuário vai poder:</w:t>
-      </w:r>
-    </w:p>
-    <w:p>
-      <w:pPr>
-        <w:rPr>
-          <w:lang w:val="pt-BR"/>
-        </w:rPr>
-      </w:pPr>
-      <w:r>
-        <w:rPr>
-          <w:lang w:val="pt-BR"/>
-        </w:rPr>
-        <w:tab/>
-        <w:t>- Visualizar o seu saldo na carteira fictícia do app.</w:t>
-      </w:r>
-    </w:p>
-    <w:p>
-      <w:pPr>
-        <w:rPr>
-          <w:lang w:val="pt-BR"/>
-        </w:rPr>
-      </w:pPr>
-      <w:r>
-        <w:rPr>
-          <w:lang w:val="pt-BR"/>
-        </w:rPr>
-        <w:tab/>
-        <w:t>- Visualizar startups disponíveis para negociação.</w:t>
-      </w:r>
-    </w:p>
-    <w:p>
-      <w:pPr>
-        <w:ind w:firstLine="720"/>
-        <w:rPr>
-          <w:lang w:val="pt-BR"/>
-        </w:rPr>
-      </w:pPr>
-      <w:r>
-        <w:rPr>
-          <w:lang w:val="pt-BR"/>
-        </w:rPr>
-        <w:t xml:space="preserve"> </w:t>
-      </w:r>
-      <w:r>
-        <w:rPr>
-          <w:lang w:val="pt-BR"/>
-        </w:rPr>
-        <w:t>- Acessar o histórico de preços.</w:t>
-      </w:r>
-    </w:p>
-    <w:p>
-      <w:pPr>
-        <w:ind w:left="720"/>
-        <w:rPr>
-          <w:lang w:val="pt-BR"/>
-        </w:rPr>
-      </w:pPr>
-      <w:r>
-        <w:rPr>
-          <w:lang w:val="pt-BR"/>
-        </w:rPr>
-        <w:t>- Iniciar operações de compra e vend</w:t>
-      </w:r>
-      <w:r>
-        <w:rPr>
-          <w:lang w:val="pt-BR"/>
-        </w:rPr>
-        <w:t>a.</w:t>
-      </w:r>
-    </w:p>
-    <w:p>
-      <w:pPr>
-        <w:pStyle w:val="Heading3"/>
-        <w:rPr>
-          <w:lang w:val="pt-BR"/>
-        </w:rPr>
-      </w:pPr>
-      <w:bookmarkStart w:id="11" w:name="_Toc224244153"/>
-      <w:r>
-        <w:rPr>
-          <w:lang w:val="pt-BR"/>
-        </w:rPr>
-        <w:t>RF10</w:t>
-      </w:r>
-      <w:r>
-        <w:rPr>
-          <w:lang w:val="pt-BR"/>
-        </w:rPr>
-        <w:t>-</w:t>
-      </w:r>
-      <w:r>
-        <w:rPr>
-          <w:lang w:val="pt-BR"/>
-        </w:rPr>
-        <w:t xml:space="preserve"> Carteira:</w:t>
-      </w:r>
-      <w:bookmarkEnd w:id="11"/>
-    </w:p>
-    <w:p>
-      <w:pPr>
-        <w:rPr>
-          <w:lang w:val="pt-BR"/>
-        </w:rPr>
-      </w:pPr>
-      <w:r>
-        <w:rPr>
-          <w:lang w:val="pt-BR"/>
-        </w:rPr>
-        <w:t>- O sistema deve exibir uma tela para o usuário gerenciar sua carteira.</w:t>
-      </w:r>
-    </w:p>
-    <w:p>
-      <w:pPr>
-        <w:rPr>
-          <w:lang w:val="pt-BR"/>
-        </w:rPr>
-      </w:pPr>
-      <w:r>
-        <w:rPr>
-          <w:lang w:val="pt-BR"/>
-        </w:rPr>
-        <w:t>- O sistema deve manter para cada usuário, o seu saldo em reais (simulado)</w:t>
-      </w:r>
-    </w:p>
-    <w:p>
-      <w:pPr>
-        <w:rPr>
-          <w:lang w:val="pt-BR"/>
-        </w:rPr>
-      </w:pPr>
-      <w:r>
-        <w:rPr>
-          <w:lang w:val="pt-BR"/>
-        </w:rPr>
-        <w:t>- O usuário deve poder:</w:t>
-      </w:r>
-    </w:p>
-    <w:p>
-      <w:pPr>
-        <w:rPr>
-          <w:lang w:val="pt-BR"/>
-        </w:rPr>
-      </w:pPr>
-      <w:r>
-        <w:rPr>
-          <w:lang w:val="pt-BR"/>
-        </w:rPr>
-        <w:tab/>
-        <w:t>- Ver quanto saldo resta na sua carteira</w:t>
-      </w:r>
-    </w:p>
-    <w:p>
-      <w:pPr>
-        <w:rPr>
-          <w:lang w:val="pt-BR"/>
-        </w:rPr>
-      </w:pPr>
-      <w:r>
-        <w:rPr>
-          <w:lang w:val="pt-BR"/>
-        </w:rPr>
-        <w:tab/>
-        <w:t xml:space="preserve">- Ver </w:t>
-      </w:r>
-      <w:r>
-        <w:rPr>
-          <w:lang w:val="pt-BR"/>
-        </w:rPr>
-        <w:t>a quantidade de tokens ele tem (por startup, quais startups, total de tokens, total preço dos tokens).</w:t>
-      </w:r>
-    </w:p>
-    <w:p>
-      <w:pPr>
-        <w:rPr>
-          <w:lang w:val="pt-BR"/>
-        </w:rPr>
-      </w:pPr>
-      <w:r>
-        <w:rPr>
-          <w:lang w:val="pt-BR"/>
-        </w:rPr>
-        <w:tab/>
-        <w:t>- Ver quanto sua carteira valorizou a partir do momento de adicionar saldo (valorização dos tokens comprados)</w:t>
-      </w:r>
-      <w:r>
-        <w:rPr>
-          <w:lang w:val="pt-BR"/>
-        </w:rPr>
-        <w:t>.</w:t>
+      <w:bookmarkStart w:id="15" w:name="_Toc224244157"/>
+      <w:r>
+        <w:rPr>
+          <w:lang w:val="pt-BR"/>
+        </w:rPr>
+        <w:t>RF14- Perfil do usuário:</w:t>
+      </w:r>
+      <w:bookmarkEnd w:id="15"/>
+    </w:p>
+    <w:p>
+      <w:pPr>
+        <w:rPr>
+          <w:lang w:val="pt-BR"/>
+        </w:rPr>
+      </w:pPr>
+      <w:r>
+        <w:rPr>
+          <w:lang w:val="pt-BR"/>
+        </w:rPr>
+        <w:t>- O sistema deve permitir que o usuário visualize suas informações básicas:</w:t>
+      </w:r>
+    </w:p>
+    <w:p>
+      <w:pPr>
+        <w:rPr>
+          <w:lang w:val="pt-BR"/>
+        </w:rPr>
+      </w:pPr>
+      <w:r>
+        <w:rPr>
+          <w:lang w:val="pt-BR"/>
+        </w:rPr>
+        <w:tab/>
+        <w:t>- Nome completo.</w:t>
+      </w:r>
+    </w:p>
+    <w:p>
+      <w:pPr>
+        <w:rPr>
+          <w:lang w:val="pt-BR"/>
+        </w:rPr>
+      </w:pPr>
+      <w:r>
+        <w:rPr>
+          <w:lang w:val="pt-BR"/>
+        </w:rPr>
+        <w:tab/>
+        <w:t>- Email.</w:t>
+      </w:r>
+    </w:p>
+    <w:p>
+      <w:pPr>
+        <w:rPr>
+          <w:lang w:val="pt-BR"/>
+        </w:rPr>
+      </w:pPr>
+      <w:r>
+        <w:rPr>
+          <w:lang w:val="pt-BR"/>
+        </w:rPr>
+        <w:tab/>
+        <w:t>- CPF.</w:t>
       </w:r>
     </w:p>
     <w:p>
@@ -2549,856 +3448,6 @@
           <w:lang w:val="pt-BR"/>
         </w:rPr>
         <w:lastRenderedPageBreak/>
-        <w:tab/>
-        <w:t>- Adicionar saldo à sua carteira.</w:t>
-      </w:r>
-      <w:r>
-        <w:rPr>
-          <w:lang w:val="pt-BR"/>
-        </w:rPr>
-        <w:t xml:space="preserve"> (Saldo inicial</w:t>
-      </w:r>
-      <w:r>
-        <w:rPr>
-          <w:lang w:val="pt-BR"/>
-        </w:rPr>
-        <w:t>? Pix simulado – Limitado com valor e por período de tempo</w:t>
-      </w:r>
-      <w:r>
-        <w:rPr>
-          <w:lang w:val="pt-BR"/>
-        </w:rPr>
-        <w:t>)</w:t>
-      </w:r>
-      <w:r>
-        <w:rPr>
-          <w:lang w:val="pt-BR"/>
-        </w:rPr>
-        <w:t>.</w:t>
-      </w:r>
-    </w:p>
-    <w:p>
-      <w:pPr>
-        <w:rPr>
-          <w:lang w:val="pt-BR"/>
-        </w:rPr>
-      </w:pPr>
-      <w:r>
-        <w:rPr>
-          <w:lang w:val="pt-BR"/>
-        </w:rPr>
-        <w:tab/>
-        <w:t>- Sacar saldo da sua carteira</w:t>
-      </w:r>
-      <w:r>
-        <w:rPr>
-          <w:lang w:val="pt-BR"/>
-        </w:rPr>
-        <w:t>.</w:t>
-      </w:r>
-    </w:p>
-    <w:p>
-      <w:pPr>
-        <w:pStyle w:val="Heading3"/>
-        <w:rPr>
-          <w:lang w:val="pt-BR"/>
-        </w:rPr>
-      </w:pPr>
-      <w:bookmarkStart w:id="12" w:name="_Toc224244154"/>
-      <w:r>
-        <w:rPr>
-          <w:lang w:val="pt-BR"/>
-        </w:rPr>
-        <w:t>RF</w:t>
-      </w:r>
-      <w:r>
-        <w:rPr>
-          <w:lang w:val="pt-BR"/>
-        </w:rPr>
-        <w:t>11</w:t>
-      </w:r>
-      <w:r>
-        <w:rPr>
-          <w:lang w:val="pt-BR"/>
-        </w:rPr>
-        <w:t>- Compra de tokens:</w:t>
-      </w:r>
-      <w:bookmarkEnd w:id="12"/>
-    </w:p>
-    <w:p>
-      <w:pPr>
-        <w:rPr>
-          <w:lang w:val="pt-BR"/>
-        </w:rPr>
-      </w:pPr>
-      <w:r>
-        <w:rPr>
-          <w:lang w:val="pt-BR"/>
-        </w:rPr>
-        <w:t>- O sistema deve permitir o usuário comprar tokens de uma startup:</w:t>
-      </w:r>
-    </w:p>
-    <w:p>
-      <w:pPr>
-        <w:rPr>
-          <w:lang w:val="pt-BR"/>
-        </w:rPr>
-      </w:pPr>
-      <w:r>
-        <w:rPr>
-          <w:lang w:val="pt-BR"/>
-        </w:rPr>
-        <w:tab/>
-        <w:t>- Na tela de startup.</w:t>
-      </w:r>
-    </w:p>
-    <w:p>
-      <w:pPr>
-        <w:rPr>
-          <w:lang w:val="pt-BR"/>
-        </w:rPr>
-      </w:pPr>
-      <w:r>
-        <w:rPr>
-          <w:lang w:val="pt-BR"/>
-        </w:rPr>
-        <w:tab/>
-        <w:t>- Na tela de balcão</w:t>
-      </w:r>
-      <w:r>
-        <w:rPr>
-          <w:lang w:val="pt-BR"/>
-        </w:rPr>
-        <w:t xml:space="preserve"> de negociações</w:t>
-      </w:r>
-      <w:r>
-        <w:rPr>
-          <w:lang w:val="pt-BR"/>
-        </w:rPr>
-        <w:t>.</w:t>
-      </w:r>
-    </w:p>
-    <w:p>
-      <w:pPr>
-        <w:ind w:firstLine="720"/>
-        <w:rPr>
-          <w:lang w:val="pt-BR"/>
-        </w:rPr>
-      </w:pPr>
-      <w:r>
-        <w:rPr>
-          <w:lang w:val="pt-BR"/>
-        </w:rPr>
-        <w:t>- O usuário pode colocar ofertas de acordo com o preço atual do token.</w:t>
-      </w:r>
-    </w:p>
-    <w:p>
-      <w:pPr>
-        <w:rPr>
-          <w:lang w:val="pt-BR"/>
-        </w:rPr>
-      </w:pPr>
-      <w:r>
-        <w:rPr>
-          <w:lang w:val="pt-BR"/>
-        </w:rPr>
-        <w:t>- Regras mínimas:</w:t>
-      </w:r>
-    </w:p>
-    <w:p>
-      <w:pPr>
-        <w:ind w:firstLine="720"/>
-        <w:rPr>
-          <w:lang w:val="pt-BR"/>
-        </w:rPr>
-      </w:pPr>
-      <w:r>
-        <w:rPr>
-          <w:lang w:val="pt-BR"/>
-        </w:rPr>
-        <w:t>- O sistema deve validar se a startup tem tokens disponíveis para compra</w:t>
-      </w:r>
-      <w:r>
-        <w:rPr>
-          <w:lang w:val="pt-BR"/>
-        </w:rPr>
-        <w:t>.</w:t>
-      </w:r>
-    </w:p>
-    <w:p>
-      <w:pPr>
-        <w:ind w:firstLine="720"/>
-        <w:rPr>
-          <w:lang w:val="pt-BR"/>
-        </w:rPr>
-      </w:pPr>
-      <w:r>
-        <w:rPr>
-          <w:lang w:val="pt-BR"/>
-        </w:rPr>
-        <w:t xml:space="preserve">- </w:t>
-      </w:r>
-      <w:r>
-        <w:rPr>
-          <w:lang w:val="pt-BR"/>
-        </w:rPr>
-        <w:t xml:space="preserve">O sistema deve validar se o usuário possui saldo disponível </w:t>
-      </w:r>
-      <w:r>
-        <w:rPr>
-          <w:lang w:val="pt-BR"/>
-        </w:rPr>
-        <w:t xml:space="preserve">e suficiente </w:t>
-      </w:r>
-      <w:r>
-        <w:rPr>
-          <w:lang w:val="pt-BR"/>
-        </w:rPr>
-        <w:t>em sua carteira antes de confirmar a compra</w:t>
-      </w:r>
-      <w:r>
-        <w:rPr>
-          <w:lang w:val="pt-BR"/>
-        </w:rPr>
-        <w:t>.</w:t>
-      </w:r>
-    </w:p>
-    <w:p>
-      <w:pPr>
-        <w:ind w:firstLine="720"/>
-        <w:rPr>
-          <w:lang w:val="pt-BR"/>
-        </w:rPr>
-      </w:pPr>
-      <w:r>
-        <w:rPr>
-          <w:lang w:val="pt-BR"/>
-        </w:rPr>
-        <w:t>- O sistema confirmar com o usuário que ele está comprando X tokens por Y reais e vai sobrar Z reais de saldo.</w:t>
-      </w:r>
-    </w:p>
-    <w:p>
-      <w:pPr>
-        <w:ind w:firstLine="720"/>
-        <w:rPr>
-          <w:lang w:val="pt-BR"/>
-        </w:rPr>
-      </w:pPr>
-      <w:r>
-        <w:rPr>
-          <w:lang w:val="pt-BR"/>
-        </w:rPr>
-        <w:t>- O sistema deve debitar o valor da compra do saldo da carteira.</w:t>
-      </w:r>
-    </w:p>
-    <w:p>
-      <w:pPr>
-        <w:ind w:firstLine="720"/>
-        <w:rPr>
-          <w:lang w:val="pt-BR"/>
-        </w:rPr>
-      </w:pPr>
-      <w:r>
-        <w:rPr>
-          <w:lang w:val="pt-BR"/>
-        </w:rPr>
-        <w:t>- O sistema deve registrar a quantidade de tokens adquiridos.</w:t>
-      </w:r>
-    </w:p>
-    <w:p>
-      <w:pPr>
-        <w:ind w:firstLine="720"/>
-        <w:rPr>
-          <w:lang w:val="pt-BR"/>
-        </w:rPr>
-      </w:pPr>
-      <w:r>
-        <w:rPr>
-          <w:lang w:val="pt-BR"/>
-        </w:rPr>
-        <w:t>- O sistema deve registrar a transação no histórico (data/hora, quantidade, valor por token, valor total).</w:t>
-      </w:r>
-    </w:p>
-    <w:p>
-      <w:pPr>
-        <w:rPr>
-          <w:lang w:val="pt-BR"/>
-        </w:rPr>
-      </w:pPr>
-      <w:r>
-        <w:rPr>
-          <w:lang w:val="pt-BR"/>
-        </w:rPr>
-        <w:t>- Caso o usuário não tenha saldo suficiente, ele deve ser alertado e direcionado para a pagina de carteira para adicionar saldo, após o usuário adicionar saldo, confirmar se o usuário quer comprar os tokens. Fluxo: (Comprar tokens-&gt;Saldo Insuficiente-&gt;Ir para carteira/Cancelar-&gt;Adicionou Saldo-&gt;Tela de compra-&gt;Confirmar Compra-&gt;Dashboard)</w:t>
-      </w:r>
-    </w:p>
-    <w:p>
-      <w:pPr>
-        <w:rPr>
-          <w:lang w:val="pt-BR"/>
-        </w:rPr>
-      </w:pPr>
-    </w:p>
-    <w:p>
-      <w:pPr>
-        <w:pStyle w:val="Heading3"/>
-        <w:rPr>
-          <w:lang w:val="pt-BR"/>
-        </w:rPr>
-      </w:pPr>
-      <w:bookmarkStart w:id="13" w:name="_Toc224244155"/>
-      <w:r>
-        <w:rPr>
-          <w:lang w:val="pt-BR"/>
-        </w:rPr>
-        <w:t>RF12- Venda de tokens</w:t>
-      </w:r>
-      <w:r>
-        <w:rPr>
-          <w:lang w:val="pt-BR"/>
-        </w:rPr>
-        <w:t>:</w:t>
-      </w:r>
-      <w:bookmarkEnd w:id="13"/>
-    </w:p>
-    <w:p>
-      <w:pPr>
-        <w:rPr>
-          <w:lang w:val="pt-BR"/>
-        </w:rPr>
-      </w:pPr>
-      <w:r>
-        <w:rPr>
-          <w:lang w:val="pt-BR"/>
-        </w:rPr>
-        <w:t>- O sistema deve permitir o usuário vender tokens:</w:t>
-      </w:r>
-    </w:p>
-    <w:p>
-      <w:pPr>
-        <w:rPr>
-          <w:lang w:val="pt-BR"/>
-        </w:rPr>
-      </w:pPr>
-      <w:r>
-        <w:rPr>
-          <w:lang w:val="pt-BR"/>
-        </w:rPr>
-        <w:tab/>
-        <w:t>- Na tela da startup.</w:t>
-      </w:r>
-    </w:p>
-    <w:p>
-      <w:pPr>
-        <w:rPr>
-          <w:lang w:val="pt-BR"/>
-        </w:rPr>
-      </w:pPr>
-      <w:r>
-        <w:rPr>
-          <w:lang w:val="pt-BR"/>
-        </w:rPr>
-        <w:tab/>
-        <w:t>- Na tela do balcão de negociações</w:t>
-      </w:r>
-    </w:p>
-    <w:p>
-      <w:pPr>
-        <w:rPr>
-          <w:lang w:val="pt-BR"/>
-        </w:rPr>
-      </w:pPr>
-      <w:r>
-        <w:rPr>
-          <w:lang w:val="pt-BR"/>
-        </w:rPr>
-        <w:t>- O usuário pode vender tokens de acordo com o preço atual do token.</w:t>
-      </w:r>
-    </w:p>
-    <w:p>
-      <w:pPr>
-        <w:rPr>
-          <w:lang w:val="pt-BR"/>
-        </w:rPr>
-      </w:pPr>
-      <w:r>
-        <w:rPr>
-          <w:lang w:val="pt-BR"/>
-        </w:rPr>
-        <w:lastRenderedPageBreak/>
-        <w:t>- Regras mínimas:</w:t>
-      </w:r>
-    </w:p>
-    <w:p>
-      <w:pPr>
-        <w:rPr>
-          <w:lang w:val="pt-BR"/>
-        </w:rPr>
-      </w:pPr>
-      <w:r>
-        <w:rPr>
-          <w:lang w:val="pt-BR"/>
-        </w:rPr>
-        <w:tab/>
-        <w:t>- O sistema deve verificar se o usuário possui quantidade suficiente de tokens.</w:t>
-      </w:r>
-    </w:p>
-    <w:p>
-      <w:pPr>
-        <w:rPr>
-          <w:lang w:val="pt-BR"/>
-        </w:rPr>
-      </w:pPr>
-      <w:r>
-        <w:rPr>
-          <w:lang w:val="pt-BR"/>
-        </w:rPr>
-        <w:tab/>
-        <w:t xml:space="preserve">-  </w:t>
-      </w:r>
-      <w:r>
-        <w:rPr>
-          <w:lang w:val="pt-BR"/>
-        </w:rPr>
-        <w:t xml:space="preserve">O sistema deve </w:t>
-      </w:r>
-      <w:r>
-        <w:rPr>
-          <w:lang w:val="pt-BR"/>
-        </w:rPr>
-        <w:t>debitar a quantidade de tokens vendidos do usuário.</w:t>
-      </w:r>
-    </w:p>
-    <w:p>
-      <w:pPr>
-        <w:rPr>
-          <w:lang w:val="pt-BR"/>
-        </w:rPr>
-      </w:pPr>
-      <w:r>
-        <w:rPr>
-          <w:lang w:val="pt-BR"/>
-        </w:rPr>
-        <w:tab/>
-        <w:t>-</w:t>
-      </w:r>
-      <w:r>
-        <w:rPr>
-          <w:lang w:val="pt-BR"/>
-        </w:rPr>
-        <w:t xml:space="preserve"> </w:t>
-      </w:r>
-      <w:r>
-        <w:rPr>
-          <w:lang w:val="pt-BR"/>
-        </w:rPr>
-        <w:t>O sistema deve</w:t>
-      </w:r>
-      <w:r>
-        <w:rPr>
-          <w:lang w:val="pt-BR"/>
-        </w:rPr>
-        <w:t xml:space="preserve"> adicionar o valor dos tokens vendidos na carteira do usuário.</w:t>
-      </w:r>
-    </w:p>
-    <w:p>
-      <w:pPr>
-        <w:rPr>
-          <w:lang w:val="pt-BR"/>
-        </w:rPr>
-      </w:pPr>
-      <w:r>
-        <w:rPr>
-          <w:lang w:val="pt-BR"/>
-        </w:rPr>
-        <w:tab/>
-        <w:t xml:space="preserve">- </w:t>
-      </w:r>
-      <w:r>
-        <w:rPr>
-          <w:lang w:val="pt-BR"/>
-        </w:rPr>
-        <w:t xml:space="preserve">O sistema deve </w:t>
-      </w:r>
-      <w:r>
-        <w:rPr>
-          <w:lang w:val="pt-BR"/>
-        </w:rPr>
-        <w:t>registrar a transação no histórico(data/hora, quantidade, valor por token, valor total)</w:t>
-      </w:r>
-    </w:p>
-    <w:p>
-      <w:pPr>
-        <w:pStyle w:val="Heading3"/>
-        <w:rPr>
-          <w:lang w:val="pt-BR"/>
-        </w:rPr>
-      </w:pPr>
-      <w:bookmarkStart w:id="14" w:name="_Toc224244156"/>
-      <w:r>
-        <w:rPr>
-          <w:lang w:val="pt-BR"/>
-        </w:rPr>
-        <w:t>RF13- Dashboard de investimentos e valorização:</w:t>
-      </w:r>
-      <w:bookmarkEnd w:id="14"/>
-    </w:p>
-    <w:p>
-      <w:pPr>
-        <w:rPr>
-          <w:lang w:val="pt-BR"/>
-        </w:rPr>
-      </w:pPr>
-      <w:r>
-        <w:rPr>
-          <w:lang w:val="pt-BR"/>
-        </w:rPr>
-        <w:t>- O sistema deve exibir um painel dashboard com:</w:t>
-      </w:r>
-    </w:p>
-    <w:p>
-      <w:pPr>
-        <w:rPr>
-          <w:lang w:val="pt-BR"/>
-        </w:rPr>
-      </w:pPr>
-      <w:r>
-        <w:rPr>
-          <w:lang w:val="pt-BR"/>
-        </w:rPr>
-        <w:tab/>
-        <w:t>- Lista de startups que o usuário possui token.</w:t>
-      </w:r>
-    </w:p>
-    <w:p>
-      <w:pPr>
-        <w:rPr>
-          <w:lang w:val="pt-BR"/>
-        </w:rPr>
-      </w:pPr>
-      <w:r>
-        <w:rPr>
-          <w:lang w:val="pt-BR"/>
-        </w:rPr>
-        <w:tab/>
-        <w:t xml:space="preserve">- </w:t>
-      </w:r>
-      <w:r>
-        <w:rPr>
-          <w:lang w:val="pt-BR"/>
-        </w:rPr>
-        <w:t>Pequeno gráfico para cada startup investida.</w:t>
-      </w:r>
-    </w:p>
-    <w:p>
-      <w:pPr>
-        <w:rPr>
-          <w:lang w:val="pt-BR"/>
-        </w:rPr>
-      </w:pPr>
-      <w:r>
-        <w:rPr>
-          <w:lang w:val="pt-BR"/>
-        </w:rPr>
-        <w:tab/>
-        <w:t>- Porcentagem de lucro a partir do momento da compra do token.</w:t>
-      </w:r>
-    </w:p>
-    <w:p>
-      <w:pPr>
-        <w:rPr>
-          <w:lang w:val="pt-BR"/>
-        </w:rPr>
-      </w:pPr>
-      <w:r>
-        <w:rPr>
-          <w:lang w:val="pt-BR"/>
-        </w:rPr>
-        <w:tab/>
-        <w:t>- Quantidade de token por startup.</w:t>
-      </w:r>
-    </w:p>
-    <w:p>
-      <w:pPr>
-        <w:rPr>
-          <w:lang w:val="pt-BR"/>
-        </w:rPr>
-      </w:pPr>
-      <w:r>
-        <w:rPr>
-          <w:lang w:val="pt-BR"/>
-        </w:rPr>
-        <w:tab/>
-        <w:t>- Valor atual de cada investimento.</w:t>
-      </w:r>
-    </w:p>
-    <w:p>
-      <w:pPr>
-        <w:rPr>
-          <w:lang w:val="pt-BR"/>
-        </w:rPr>
-      </w:pPr>
-      <w:r>
-        <w:rPr>
-          <w:lang w:val="pt-BR"/>
-        </w:rPr>
-        <w:tab/>
-        <w:t>- Valor total da carteira de tokens (reais).</w:t>
-      </w:r>
-    </w:p>
-    <w:p>
-      <w:pPr>
-        <w:rPr>
-          <w:lang w:val="pt-BR"/>
-        </w:rPr>
-      </w:pPr>
-      <w:r>
-        <w:rPr>
-          <w:lang w:val="pt-BR"/>
-        </w:rPr>
-        <w:tab/>
-        <w:t>- Gráfico de valorização da carteira.</w:t>
-      </w:r>
-    </w:p>
-    <w:p>
-      <w:pPr>
-        <w:rPr>
-          <w:lang w:val="pt-BR"/>
-        </w:rPr>
-      </w:pPr>
-      <w:r>
-        <w:rPr>
-          <w:lang w:val="pt-BR"/>
-        </w:rPr>
-        <w:t>- O sistema deve permitir a filtragem dos gráficos exibidos com a variação do valor dos tokens com os seguintes períodos:</w:t>
-      </w:r>
-    </w:p>
-    <w:p>
-      <w:pPr>
-        <w:rPr>
-          <w:lang w:val="pt-BR"/>
-        </w:rPr>
-      </w:pPr>
-      <w:r>
-        <w:rPr>
-          <w:lang w:val="pt-BR"/>
-        </w:rPr>
-        <w:tab/>
-        <w:t>- Diário.</w:t>
-      </w:r>
-    </w:p>
-    <w:p>
-      <w:pPr>
-        <w:rPr>
-          <w:lang w:val="pt-BR"/>
-        </w:rPr>
-      </w:pPr>
-      <w:r>
-        <w:rPr>
-          <w:lang w:val="pt-BR"/>
-        </w:rPr>
-        <w:tab/>
-        <w:t>- Semanal.</w:t>
-      </w:r>
-    </w:p>
-    <w:p>
-      <w:pPr>
-        <w:rPr>
-          <w:lang w:val="pt-BR"/>
-        </w:rPr>
-      </w:pPr>
-      <w:r>
-        <w:rPr>
-          <w:lang w:val="pt-BR"/>
-        </w:rPr>
-        <w:tab/>
-        <w:t>- Mensal.</w:t>
-      </w:r>
-    </w:p>
-    <w:p>
-      <w:pPr>
-        <w:rPr>
-          <w:lang w:val="pt-BR"/>
-        </w:rPr>
-      </w:pPr>
-      <w:r>
-        <w:rPr>
-          <w:lang w:val="pt-BR"/>
-        </w:rPr>
-        <w:tab/>
-        <w:t xml:space="preserve">- </w:t>
-      </w:r>
-      <w:r>
-        <w:rPr>
-          <w:lang w:val="pt-BR"/>
-        </w:rPr>
-        <w:t>Últimos</w:t>
-      </w:r>
-      <w:r>
-        <w:rPr>
-          <w:lang w:val="pt-BR"/>
-        </w:rPr>
-        <w:t xml:space="preserve"> 6 meses.</w:t>
-      </w:r>
-    </w:p>
-    <w:p>
-      <w:pPr>
-        <w:rPr>
-          <w:lang w:val="pt-BR"/>
-        </w:rPr>
-      </w:pPr>
-      <w:r>
-        <w:rPr>
-          <w:lang w:val="pt-BR"/>
-        </w:rPr>
-        <w:tab/>
-        <w:t>- YTD.</w:t>
-      </w:r>
-    </w:p>
-    <w:p>
-      <w:pPr>
-        <w:rPr>
-          <w:lang w:val="pt-BR"/>
-        </w:rPr>
-      </w:pPr>
-      <w:r>
-        <w:rPr>
-          <w:lang w:val="pt-BR"/>
-        </w:rPr>
-        <w:t xml:space="preserve">- A logica de </w:t>
-      </w:r>
-      <w:r>
-        <w:rPr>
-          <w:lang w:val="pt-BR"/>
-        </w:rPr>
-        <w:t>cálculo</w:t>
-      </w:r>
-      <w:r>
-        <w:rPr>
-          <w:lang w:val="pt-BR"/>
-        </w:rPr>
-        <w:t xml:space="preserve"> do valor dos tokens (preço, variação, tendência) vai ser com base no mercado real, com um </w:t>
-      </w:r>
-      <w:r>
-        <w:rPr>
-          <w:lang w:val="pt-BR"/>
-        </w:rPr>
-        <w:t>‘</w:t>
-      </w:r>
-      <w:r>
-        <w:rPr>
-          <w:lang w:val="pt-BR"/>
-        </w:rPr>
-        <w:t>order book</w:t>
-      </w:r>
-      <w:r>
-        <w:rPr>
-          <w:lang w:val="pt-BR"/>
-        </w:rPr>
-        <w:t>’</w:t>
-      </w:r>
-      <w:r>
-        <w:rPr>
-          <w:lang w:val="pt-BR"/>
-        </w:rPr>
-        <w:t xml:space="preserve"> para cada token.</w:t>
-      </w:r>
-    </w:p>
-    <w:p>
-      <w:pPr>
-        <w:rPr>
-          <w:lang w:val="pt-BR"/>
-        </w:rPr>
-      </w:pPr>
-      <w:r>
-        <w:rPr>
-          <w:lang w:val="pt-BR"/>
-        </w:rPr>
-        <w:t>- Para melhor simulação e manter uma liquidez e movimento mais “real” do mercado, vamos utilizar um simulador de Montecarlo.</w:t>
-      </w:r>
-    </w:p>
-    <w:p>
-      <w:pPr>
-        <w:pStyle w:val="Heading3"/>
-        <w:rPr>
-          <w:lang w:val="pt-BR"/>
-        </w:rPr>
-      </w:pPr>
-      <w:bookmarkStart w:id="15" w:name="_Toc224244157"/>
-      <w:r>
-        <w:rPr>
-          <w:lang w:val="pt-BR"/>
-        </w:rPr>
-        <w:lastRenderedPageBreak/>
-        <w:t>RF14- Perfil do usuário:</w:t>
-      </w:r>
-      <w:bookmarkEnd w:id="15"/>
-    </w:p>
-    <w:p>
-      <w:pPr>
-        <w:rPr>
-          <w:lang w:val="pt-BR"/>
-        </w:rPr>
-      </w:pPr>
-      <w:r>
-        <w:rPr>
-          <w:lang w:val="pt-BR"/>
-        </w:rPr>
-        <w:t>- O sistema deve permitir que o usuário visualize suas informações básicas:</w:t>
-      </w:r>
-    </w:p>
-    <w:p>
-      <w:pPr>
-        <w:rPr>
-          <w:lang w:val="pt-BR"/>
-        </w:rPr>
-      </w:pPr>
-      <w:r>
-        <w:rPr>
-          <w:lang w:val="pt-BR"/>
-        </w:rPr>
-        <w:tab/>
-        <w:t>- Nome completo.</w:t>
-      </w:r>
-    </w:p>
-    <w:p>
-      <w:pPr>
-        <w:rPr>
-          <w:lang w:val="pt-BR"/>
-        </w:rPr>
-      </w:pPr>
-      <w:r>
-        <w:rPr>
-          <w:lang w:val="pt-BR"/>
-        </w:rPr>
-        <w:tab/>
-        <w:t>- Email.</w:t>
-      </w:r>
-    </w:p>
-    <w:p>
-      <w:pPr>
-        <w:rPr>
-          <w:lang w:val="pt-BR"/>
-        </w:rPr>
-      </w:pPr>
-      <w:r>
-        <w:rPr>
-          <w:lang w:val="pt-BR"/>
-        </w:rPr>
-        <w:tab/>
-        <w:t>- CPF.</w:t>
-      </w:r>
-    </w:p>
-    <w:p>
-      <w:pPr>
-        <w:rPr>
-          <w:lang w:val="pt-BR"/>
-        </w:rPr>
-      </w:pPr>
-      <w:r>
-        <w:rPr>
-          <w:lang w:val="pt-BR"/>
-        </w:rPr>
         <w:tab/>
         <w:t>- Telefone.</w:t>
       </w:r>
@@ -3477,6 +3526,503 @@
           <w:lang w:val="pt-BR"/>
         </w:rPr>
         <w:t xml:space="preserve"> </w:t>
+      </w:r>
+      <w:r>
+        <w:rPr>
+          <w:lang w:val="pt-BR"/>
+        </w:rPr>
+        <w:t>Plataforma e tecnologias:</w:t>
+      </w:r>
+    </w:p>
+    <w:p>
+      <w:pPr>
+        <w:rPr>
+          <w:lang w:val="pt-BR"/>
+        </w:rPr>
+      </w:pPr>
+      <w:r>
+        <w:rPr>
+          <w:lang w:val="pt-BR"/>
+        </w:rPr>
+        <w:t xml:space="preserve">- O aplicativo deve ser desenvolvido em </w:t>
+      </w:r>
+      <w:proofErr w:type="spellStart"/>
+      <w:r>
+        <w:rPr>
+          <w:lang w:val="pt-BR"/>
+        </w:rPr>
+        <w:t>flutter</w:t>
+      </w:r>
+      <w:proofErr w:type="spellEnd"/>
+      <w:r>
+        <w:rPr>
+          <w:lang w:val="pt-BR"/>
+        </w:rPr>
+        <w:t xml:space="preserve"> (linguagem </w:t>
+      </w:r>
+      <w:proofErr w:type="spellStart"/>
+      <w:r>
+        <w:rPr>
+          <w:lang w:val="pt-BR"/>
+        </w:rPr>
+        <w:t>dart</w:t>
+      </w:r>
+      <w:proofErr w:type="spellEnd"/>
+      <w:r>
+        <w:rPr>
+          <w:lang w:val="pt-BR"/>
+        </w:rPr>
+        <w:t>)</w:t>
+      </w:r>
+    </w:p>
+    <w:p>
+      <w:pPr>
+        <w:rPr>
+          <w:lang w:val="pt-BR"/>
+        </w:rPr>
+      </w:pPr>
+      <w:r>
+        <w:rPr>
+          <w:lang w:val="pt-BR"/>
+        </w:rPr>
+        <w:t xml:space="preserve">- O </w:t>
+      </w:r>
+      <w:proofErr w:type="spellStart"/>
+      <w:r>
+        <w:rPr>
+          <w:lang w:val="pt-BR"/>
+        </w:rPr>
+        <w:t>backend</w:t>
+      </w:r>
+      <w:proofErr w:type="spellEnd"/>
+      <w:r>
+        <w:rPr>
+          <w:lang w:val="pt-BR"/>
+        </w:rPr>
+        <w:t xml:space="preserve"> deve ser desenvolvido com node.js e </w:t>
+      </w:r>
+      <w:proofErr w:type="spellStart"/>
+      <w:r>
+        <w:rPr>
+          <w:lang w:val="pt-BR"/>
+        </w:rPr>
+        <w:t>typescript</w:t>
+      </w:r>
+      <w:proofErr w:type="spellEnd"/>
+    </w:p>
+    <w:p>
+      <w:pPr>
+        <w:rPr>
+          <w:lang w:val="pt-BR"/>
+        </w:rPr>
+      </w:pPr>
+      <w:r>
+        <w:rPr>
+          <w:lang w:val="pt-BR"/>
+        </w:rPr>
+        <w:t xml:space="preserve">- O banco de dados deve ser o </w:t>
+      </w:r>
+      <w:proofErr w:type="spellStart"/>
+      <w:r>
+        <w:rPr>
+          <w:lang w:val="pt-BR"/>
+        </w:rPr>
+        <w:t>firebase</w:t>
+      </w:r>
+      <w:proofErr w:type="spellEnd"/>
+      <w:r>
+        <w:rPr>
+          <w:lang w:val="pt-BR"/>
+        </w:rPr>
+        <w:t xml:space="preserve"> </w:t>
+      </w:r>
+      <w:proofErr w:type="spellStart"/>
+      <w:r>
+        <w:rPr>
+          <w:lang w:val="pt-BR"/>
+        </w:rPr>
+        <w:t>firestore</w:t>
+      </w:r>
+      <w:proofErr w:type="spellEnd"/>
+      <w:r>
+        <w:rPr>
+          <w:lang w:val="pt-BR"/>
+        </w:rPr>
+        <w:t xml:space="preserve"> (</w:t>
+      </w:r>
+      <w:proofErr w:type="spellStart"/>
+      <w:r>
+        <w:rPr>
+          <w:lang w:val="pt-BR"/>
+        </w:rPr>
+        <w:t>nosql</w:t>
+      </w:r>
+      <w:proofErr w:type="spellEnd"/>
+      <w:r>
+        <w:rPr>
+          <w:lang w:val="pt-BR"/>
+        </w:rPr>
+        <w:t>)</w:t>
+      </w:r>
+    </w:p>
+    <w:p>
+      <w:pPr>
+        <w:pStyle w:val="Heading3"/>
+        <w:rPr>
+          <w:lang w:val="pt-BR"/>
+        </w:rPr>
+      </w:pPr>
+      <w:r>
+        <w:rPr>
+          <w:lang w:val="pt-BR"/>
+        </w:rPr>
+        <w:t>RNF02- Integração e arquitetura:</w:t>
+      </w:r>
+    </w:p>
+    <w:p>
+      <w:pPr>
+        <w:rPr>
+          <w:lang w:val="pt-BR"/>
+        </w:rPr>
+      </w:pPr>
+      <w:r>
+        <w:rPr>
+          <w:lang w:val="pt-BR"/>
+        </w:rPr>
+        <w:t xml:space="preserve">- </w:t>
+      </w:r>
+      <w:proofErr w:type="spellStart"/>
+      <w:r>
+        <w:rPr>
+          <w:lang w:val="pt-BR"/>
+        </w:rPr>
+        <w:t>Backend</w:t>
+      </w:r>
+      <w:proofErr w:type="spellEnd"/>
+      <w:r>
+        <w:rPr>
+          <w:lang w:val="pt-BR"/>
+        </w:rPr>
+        <w:t xml:space="preserve"> vai simular os dados da plataforma, implementar regras de negócio e disponibilizar APIs REST para o app mobile.</w:t>
+      </w:r>
+    </w:p>
+    <w:p>
+      <w:pPr>
+        <w:rPr>
+          <w:lang w:val="pt-BR"/>
+        </w:rPr>
+      </w:pPr>
+      <w:r>
+        <w:rPr>
+          <w:lang w:val="pt-BR"/>
+        </w:rPr>
+        <w:t xml:space="preserve">- Os dados de startups serão cadastrados via </w:t>
+      </w:r>
+      <w:proofErr w:type="spellStart"/>
+      <w:r>
+        <w:rPr>
+          <w:lang w:val="pt-BR"/>
+        </w:rPr>
+        <w:t>backend</w:t>
+      </w:r>
+      <w:proofErr w:type="spellEnd"/>
+      <w:r>
+        <w:rPr>
+          <w:lang w:val="pt-BR"/>
+        </w:rPr>
+        <w:t>.</w:t>
+      </w:r>
+    </w:p>
+    <w:p>
+      <w:pPr>
+        <w:pStyle w:val="Heading3"/>
+        <w:rPr>
+          <w:lang w:val="pt-BR"/>
+        </w:rPr>
+      </w:pPr>
+      <w:r>
+        <w:rPr>
+          <w:lang w:val="pt-BR"/>
+        </w:rPr>
+        <w:t>RNF03- Segurança e autenticação:</w:t>
+      </w:r>
+    </w:p>
+    <w:p>
+      <w:pPr>
+        <w:rPr>
+          <w:lang w:val="pt-BR"/>
+        </w:rPr>
+      </w:pPr>
+      <w:r>
+        <w:rPr>
+          <w:lang w:val="pt-BR"/>
+        </w:rPr>
+        <w:t>- O sistema não deve permitir usuários sem autenticação.</w:t>
+      </w:r>
+    </w:p>
+    <w:p>
+      <w:pPr>
+        <w:rPr>
+          <w:lang w:val="pt-BR"/>
+        </w:rPr>
+      </w:pPr>
+      <w:r>
+        <w:rPr>
+          <w:lang w:val="pt-BR"/>
+        </w:rPr>
+        <w:t>- O MFA deve ser funcional.</w:t>
+      </w:r>
+    </w:p>
+    <w:p>
+      <w:pPr>
+        <w:pStyle w:val="Heading3"/>
+        <w:rPr>
+          <w:lang w:val="pt-BR"/>
+        </w:rPr>
+      </w:pPr>
+      <w:r>
+        <w:rPr>
+          <w:lang w:val="pt-BR"/>
+        </w:rPr>
+        <w:t>RNF04- Usabilidade:</w:t>
+      </w:r>
+    </w:p>
+    <w:p>
+      <w:pPr>
+        <w:rPr>
+          <w:lang w:val="pt-BR"/>
+        </w:rPr>
+      </w:pPr>
+      <w:r>
+        <w:rPr>
+          <w:lang w:val="pt-BR"/>
+        </w:rPr>
+        <w:t xml:space="preserve">- O sistema deve seguir um </w:t>
+      </w:r>
+      <w:r>
+        <w:rPr>
+          <w:lang w:val="pt-BR"/>
+        </w:rPr>
+        <w:t>padrão de um app mobile com:</w:t>
+      </w:r>
+    </w:p>
+    <w:p>
+      <w:pPr>
+        <w:rPr>
+          <w:lang w:val="pt-BR"/>
+        </w:rPr>
+      </w:pPr>
+      <w:r>
+        <w:rPr>
+          <w:lang w:val="pt-BR"/>
+        </w:rPr>
+        <w:tab/>
+        <w:t>- Navegação clara entre catálogo, detalhes, carteira, balcão, dashboard e perfil do usuário.</w:t>
+      </w:r>
+    </w:p>
+    <w:p>
+      <w:pPr>
+        <w:rPr>
+          <w:lang w:val="pt-BR"/>
+        </w:rPr>
+      </w:pPr>
+      <w:r>
+        <w:rPr>
+          <w:lang w:val="pt-BR"/>
+        </w:rPr>
+        <w:tab/>
+        <w:t>- Mensagem de erros compreensíveis ao usuário.</w:t>
+      </w:r>
+    </w:p>
+    <w:p>
+      <w:pPr>
+        <w:rPr>
+          <w:lang w:val="pt-BR"/>
+        </w:rPr>
+      </w:pPr>
+      <w:r>
+        <w:rPr>
+          <w:lang w:val="pt-BR"/>
+        </w:rPr>
+        <w:tab/>
+        <w:t>- Feedbacks claros e chamativos sobre ações chave:</w:t>
+      </w:r>
+      <w:r>
+        <w:rPr>
+          <w:lang w:val="pt-BR"/>
+        </w:rPr>
+        <w:t xml:space="preserve"> Ações relacionadas com a carteira, o saldo do usuário e tokens e ativar MFA.</w:t>
+      </w:r>
+    </w:p>
+    <w:p>
+      <w:pPr>
+        <w:pStyle w:val="Heading3"/>
+        <w:rPr>
+          <w:lang w:val="pt-BR"/>
+        </w:rPr>
+      </w:pPr>
+      <w:r>
+        <w:rPr>
+          <w:lang w:val="pt-BR"/>
+        </w:rPr>
+        <w:t>RNF05- Desempenho:</w:t>
+      </w:r>
+    </w:p>
+    <w:p>
+      <w:pPr>
+        <w:rPr>
+          <w:lang w:val="pt-BR"/>
+        </w:rPr>
+      </w:pPr>
+      <w:r>
+        <w:rPr>
+          <w:lang w:val="pt-BR"/>
+        </w:rPr>
+        <w:t xml:space="preserve">- O app deve apresentar informações </w:t>
+      </w:r>
+      <w:r>
+        <w:rPr>
+          <w:lang w:val="pt-BR"/>
+        </w:rPr>
+        <w:t xml:space="preserve">e ter o tempo de resposta em menos de 2 segundos, considerando o uso ideal, com rede e em uma </w:t>
+      </w:r>
+      <w:proofErr w:type="gramStart"/>
+      <w:r>
+        <w:rPr>
+          <w:lang w:val="pt-BR"/>
+        </w:rPr>
+        <w:t>maquina</w:t>
+      </w:r>
+      <w:proofErr w:type="gramEnd"/>
+      <w:r>
+        <w:rPr>
+          <w:lang w:val="pt-BR"/>
+        </w:rPr>
+        <w:t xml:space="preserve"> com os requisitos mínimos.</w:t>
+      </w:r>
+    </w:p>
+    <w:p>
+      <w:pPr>
+        <w:rPr>
+          <w:lang w:val="pt-BR"/>
+        </w:rPr>
+      </w:pPr>
+      <w:r>
+        <w:rPr>
+          <w:lang w:val="pt-BR"/>
+        </w:rPr>
+        <w:lastRenderedPageBreak/>
+        <w:t xml:space="preserve">- Operações de leitura devem ser otimizadas para minimizar chamadas desnecessárias ao </w:t>
+      </w:r>
+      <w:proofErr w:type="spellStart"/>
+      <w:r>
+        <w:rPr>
+          <w:lang w:val="pt-BR"/>
+        </w:rPr>
+        <w:t>backend</w:t>
+      </w:r>
+      <w:proofErr w:type="spellEnd"/>
+      <w:r>
+        <w:rPr>
+          <w:lang w:val="pt-BR"/>
+        </w:rPr>
+        <w:t xml:space="preserve"> -&gt; </w:t>
+      </w:r>
+      <w:proofErr w:type="spellStart"/>
+      <w:r>
+        <w:rPr>
+          <w:lang w:val="pt-BR"/>
+        </w:rPr>
+        <w:t>Firestore</w:t>
+      </w:r>
+      <w:proofErr w:type="spellEnd"/>
+      <w:r>
+        <w:rPr>
+          <w:lang w:val="pt-BR"/>
+        </w:rPr>
+        <w:t>.</w:t>
+      </w:r>
+    </w:p>
+    <w:p>
+      <w:pPr>
+        <w:pStyle w:val="Heading3"/>
+        <w:rPr>
+          <w:lang w:val="pt-BR"/>
+        </w:rPr>
+      </w:pPr>
+      <w:r>
+        <w:rPr>
+          <w:lang w:val="pt-BR"/>
+        </w:rPr>
+        <w:t>RNF06- Confiabilidade:</w:t>
+      </w:r>
+    </w:p>
+    <w:p>
+      <w:pPr>
+        <w:rPr>
+          <w:lang w:val="pt-BR"/>
+        </w:rPr>
+      </w:pPr>
+      <w:r>
+        <w:rPr>
+          <w:lang w:val="pt-BR"/>
+        </w:rPr>
+        <w:t>- O app deve validar as operações de compra e venda, para que seja garantida a consistência de dados:</w:t>
+      </w:r>
+    </w:p>
+    <w:p>
+      <w:pPr>
+        <w:rPr>
+          <w:lang w:val="pt-BR"/>
+        </w:rPr>
+      </w:pPr>
+      <w:r>
+        <w:rPr>
+          <w:lang w:val="pt-BR"/>
+        </w:rPr>
+        <w:tab/>
+        <w:t>- Não permitir saldo negativo.</w:t>
+      </w:r>
+    </w:p>
+    <w:p>
+      <w:pPr>
+        <w:rPr>
+          <w:lang w:val="pt-BR"/>
+        </w:rPr>
+      </w:pPr>
+      <w:r>
+        <w:rPr>
+          <w:lang w:val="pt-BR"/>
+        </w:rPr>
+        <w:tab/>
+        <w:t>- Não permitir tokens negativos.</w:t>
+      </w:r>
+    </w:p>
+    <w:p>
+      <w:pPr>
+        <w:rPr>
+          <w:lang w:val="pt-BR"/>
+        </w:rPr>
+      </w:pPr>
+      <w:r>
+        <w:rPr>
+          <w:lang w:val="pt-BR"/>
+        </w:rPr>
+        <w:t xml:space="preserve">- Em caso de falha na comunicação com o </w:t>
+      </w:r>
+      <w:proofErr w:type="spellStart"/>
+      <w:r>
+        <w:rPr>
+          <w:lang w:val="pt-BR"/>
+        </w:rPr>
+        <w:t>backend</w:t>
+      </w:r>
+      <w:proofErr w:type="spellEnd"/>
+      <w:r>
+        <w:rPr>
+          <w:lang w:val="pt-BR"/>
+        </w:rPr>
+        <w:t>, o app deve exibir mensagens de erro, e não registrar transações incompletas</w:t>
       </w:r>
     </w:p>
     <w:sectPr>
@@ -4916,7 +5462,7 @@
 </file>
 
 <file path=customXml/itemProps1.xml><?xml version="1.0" encoding="utf-8"?>
-<ds:datastoreItem xmlns:ds="http://schemas.openxmlformats.org/officeDocument/2006/customXml" ds:itemID="{1DF29441-F6F2-AF4D-BF40-53809A31230A}">
+<ds:datastoreItem xmlns:ds="http://schemas.openxmlformats.org/officeDocument/2006/customXml" ds:itemID="{9109AFF5-C45B-9148-80F4-92FADC3338BF}">
   <ds:schemaRefs>
     <ds:schemaRef ds:uri="http://schemas.openxmlformats.org/officeDocument/2006/bibliography"/>
   </ds:schemaRefs>

</xml_diff>